<commit_message>
Pass-54 closing items: figure-pair order, four live status claims
- The render carried one descending cross-reference pair, "Figures 7 and 4";
  both targets are content-correct, only the order changed.
- REVISION_STATUS and CLAUDE.md still stated the register's passage count and
  the current pass in the present tense at superseded values. The count clause
  has now carried five different numbers (54, 75, 93, 102, 115), so it is made
  count-free rather than renumbered a sixth time; the register's own front page
  is the only copy that cannot go stale. The pass-42 references elsewhere in
  REVISION_STATUS are left alone: that file is a chronicle and its record of
  what pass-42 planned is correct as history.

Co-Authored-By: Claude Opus 5 <noreply@anthropic.com>
</commit_message>
<xml_diff>
--- a/papers/DT-GSK.docx
+++ b/papers/DT-GSK.docx
@@ -63733,6 +63733,27 @@
         <w:fldChar w:fldCharType="begin"/>
       </w:r>
       <w:r>
+        <w:instrText xml:space="preserve"> REF ref_fig_cd_cec2017 \h </w:instrText>
+      </w:r>
+      <w:r>
+        <w:fldChar w:fldCharType="separate"/>
+      </w:r>
+      <w:r>
+        <w:t xml:space="preserve">4</w:t>
+      </w:r>
+      <w:r>
+        <w:fldChar w:fldCharType="end"/>
+      </w:r>
+      <w:r>
+        <w:t xml:space="preserve"> </w:t>
+      </w:r>
+      <w:r>
+        <w:t xml:space="preserve">and </w:t>
+      </w:r>
+      <w:r>
+        <w:fldChar w:fldCharType="begin"/>
+      </w:r>
+      <w:r>
         <w:instrText xml:space="preserve"> REF ref_fig_conv_cec2017_d100 \h </w:instrText>
       </w:r>
       <w:r>
@@ -63740,27 +63761,6 @@
       </w:r>
       <w:r>
         <w:t xml:space="preserve">7</w:t>
-      </w:r>
-      <w:r>
-        <w:fldChar w:fldCharType="end"/>
-      </w:r>
-      <w:r>
-        <w:t xml:space="preserve"> </w:t>
-      </w:r>
-      <w:r>
-        <w:t xml:space="preserve">and </w:t>
-      </w:r>
-      <w:r>
-        <w:fldChar w:fldCharType="begin"/>
-      </w:r>
-      <w:r>
-        <w:instrText xml:space="preserve"> REF ref_fig_cd_cec2017 \h </w:instrText>
-      </w:r>
-      <w:r>
-        <w:fldChar w:fldCharType="separate"/>
-      </w:r>
-      <w:r>
-        <w:t xml:space="preserve">4</w:t>
       </w:r>
       <w:r>
         <w:fldChar w:fldCharType="end"/>

</xml_diff>

<commit_message>
Pass-58 apply: second affiliation for A.W.M. (Zewail City), author-directed 2026-08-29
Ali Wagdy Mohamed now carries affiliation 2 — University of Science and
Technology, Zewail City of Science and Technology, 6th of October City,
Giza 12588, Egypt — in the manuscript, the DOCX shim, the supplement,
CITATION.cff and the kit's portal author table. All four gated renders are
rebuilt at their pinned epochs (main PDF double-built byte-identical;
page counts unchanged at 49/83; the response letter's page anchors verified
against the new render). Freeze re-mint follows as pass-58 / v2.31.

Co-Authored-By: Claude Opus 5 <noreply@anthropic.com>
</commit_message>
<xml_diff>
--- a/papers/DT-GSK.docx
+++ b/papers/DT-GSK.docx
@@ -51,7 +51,7 @@
         <w:rPr>
           <w:vertAlign w:val="superscript"/>
         </w:rPr>
-        <w:t xml:space="preserve">1</w:t>
+        <w:t xml:space="preserve">1,2</w:t>
       </w:r>
     </w:p>
     <w:p>
@@ -78,6 +78,24 @@
       </w:r>
       <w:r>
         <w:t xml:space="preserve">moustafa.masoud@gmail.com (M.E.M. ORCID 0009-0003-8415-2158); hmhmdss@yahoo.com (H.S.M.R. ORCID 0000-0003-0387-5876); aliwagdy@gmail.com (A.W.M. ORCID 0000-0002-5895-2632)</w:t>
+      </w:r>
+      <w:r>
+        <w:br/>
+      </w:r>
+      <w:r>
+        <w:rPr>
+          <w:vertAlign w:val="superscript"/>
+        </w:rPr>
+        <w:t xml:space="preserve">2</w:t>
+      </w:r>
+      <w:r>
+        <w:t xml:space="preserve"> University of Science and Technology, Zewail City of Science and</w:t>
+      </w:r>
+      <w:r>
+        <w:t xml:space="preserve"> </w:t>
+      </w:r>
+      <w:r>
+        <w:t xml:space="preserve">Technology, 6th of October City, Giza 12588, Egypt</w:t>
       </w:r>
       <w:r>
         <w:br/>

</xml_diff>

<commit_message>
Pass-59 apply: corresponding author's full name (Mostafa Elsayed Ahmed Masoud), author-directed 2026-08-29
The byline, PDF metadata, address block, CRediT roles and Conflicts of
Interest now carry the full name and the matching initials M.E.A.M. in the
manuscript, the Supplementary Materials, the cover letter, the plain-language
summary, CITATION.cff, README and the kit's portal table; the response letter
and the withheld author-side documents are updated in place. All renders
rebuilt at their pinned epochs (main, supplement, both DOCX, cover letter and
plain summary each double-built byte-identical; page counts unchanged 49/83;
the letter's page anchors re-verified). DAS bumped to v2.32 ahead of the
builds; freeze re-mint follows as pass-59 / v2.32.

Co-Authored-By: Claude Opus 5 <noreply@anthropic.com>
</commit_message>
<xml_diff>
--- a/papers/DT-GSK.docx
+++ b/papers/DT-GSK.docx
@@ -27,7 +27,7 @@
         <w:pStyle w:val="Author"/>
       </w:pPr>
       <w:r>
-        <w:t xml:space="preserve">Mostafa Elsayed Masoud </w:t>
+        <w:t xml:space="preserve">Mostafa Elsayed Ahmed Masoud </w:t>
       </w:r>
       <w:r>
         <w:rPr>
@@ -77,7 +77,7 @@
         <w:t xml:space="preserve"> </w:t>
       </w:r>
       <w:r>
-        <w:t xml:space="preserve">moustafa.masoud@gmail.com (M.E.M. ORCID 0009-0003-8415-2158); hmhmdss@yahoo.com (H.S.M.R. ORCID 0000-0003-0387-5876); aliwagdy@gmail.com (A.W.M. ORCID 0000-0002-5895-2632)</w:t>
+        <w:t xml:space="preserve">moustafa.masoud@gmail.com (M.E.A.M. ORCID 0009-0003-8415-2158); hmhmdss@yahoo.com (H.S.M.R. ORCID 0000-0003-0387-5876); aliwagdy@gmail.com (A.W.M. ORCID 0000-0002-5895-2632)</w:t>
       </w:r>
       <w:r>
         <w:br/>
@@ -67387,31 +67387,31 @@
         <w:pStyle w:val="FirstParagraph"/>
       </w:pPr>
       <w:r>
-        <w:t xml:space="preserve">Conceptualization, M.E.M.;</w:t>
-      </w:r>
-      <w:r>
-        <w:t xml:space="preserve"> </w:t>
-      </w:r>
-      <w:r>
-        <w:t xml:space="preserve">methodology, M.E.M. and A.W.M.; software, M.E.M.;</w:t>
-      </w:r>
-      <w:r>
-        <w:t xml:space="preserve"> </w:t>
-      </w:r>
-      <w:r>
-        <w:t xml:space="preserve">formal analysis, M.E.M. and A.W.M.; investigation, M.E.M. and A.W.M.;</w:t>
-      </w:r>
-      <w:r>
-        <w:t xml:space="preserve"> </w:t>
-      </w:r>
-      <w:r>
-        <w:t xml:space="preserve">data curation, M.E.M. and A.W.M.;</w:t>
-      </w:r>
-      <w:r>
-        <w:t xml:space="preserve"> </w:t>
-      </w:r>
-      <w:r>
-        <w:t xml:space="preserve">writing—original draft preparation, M.E.M. and A.W.M.;</w:t>
+        <w:t xml:space="preserve">Conceptualization, M.E.A.M.;</w:t>
+      </w:r>
+      <w:r>
+        <w:t xml:space="preserve"> </w:t>
+      </w:r>
+      <w:r>
+        <w:t xml:space="preserve">methodology, M.E.A.M. and A.W.M.; software, M.E.A.M.;</w:t>
+      </w:r>
+      <w:r>
+        <w:t xml:space="preserve"> </w:t>
+      </w:r>
+      <w:r>
+        <w:t xml:space="preserve">formal analysis, M.E.A.M. and A.W.M.; investigation, M.E.A.M. and A.W.M.;</w:t>
+      </w:r>
+      <w:r>
+        <w:t xml:space="preserve"> </w:t>
+      </w:r>
+      <w:r>
+        <w:t xml:space="preserve">data curation, M.E.A.M. and A.W.M.;</w:t>
+      </w:r>
+      <w:r>
+        <w:t xml:space="preserve"> </w:t>
+      </w:r>
+      <w:r>
+        <w:t xml:space="preserve">writing—original draft preparation, M.E.A.M. and A.W.M.;</w:t>
       </w:r>
       <w:r>
         <w:t xml:space="preserve"> </w:t>
@@ -67539,7 +67539,7 @@
         <w:t xml:space="preserve"> </w:t>
       </w:r>
       <w:r>
-        <w:t xml:space="preserve">tag v2.31, and any further materials are</w:t>
+        <w:t xml:space="preserve">tag v2.32, and any further materials are</w:t>
       </w:r>
       <w:r>
         <w:t xml:space="preserve"> </w:t>
@@ -68043,7 +68043,7 @@
         <w:t xml:space="preserve"> </w:t>
       </w:r>
       <w:r>
-        <w:t xml:space="preserve">supervisor of author M.E.M. One adjacency is disclosed specifically:</w:t>
+        <w:t xml:space="preserve">supervisor of author M.E.A.M. One adjacency is disclosed specifically:</w:t>
       </w:r>
       <w:r>
         <w:t xml:space="preserve"> </w:t>

</xml_diff>

<commit_message>
Pass-67 apply: title revised and affiliations aligned across all artifacts
The authors revised the article title to 'DT-GSK: Dimension-Tiered Adaptive
Configuration Selection and Deterministic Refinement for Gaining-Sharing
Knowledge-Based Optimization Algorithm' and supplied corrected affiliations
(Department of Operations Research; affiliation 2 gains the Mathematics
Program, becomes October Gardens, 6th of October, and its postcode is
corrected from 12588 to 12578).

Applied to main.tex, supplementary.tex, CITATION.cff (article title only -
the software title names the software), build_docx.py's DOCX metadata for
both documents, and SUBMISSION_KIT. All four renders rebuilt twice and
byte-identical; title and affiliations verified in each.

Co-Authored-By: Claude Opus 5 <noreply@anthropic.com>
</commit_message>
<xml_diff>
--- a/papers/DT-GSK.docx
+++ b/papers/DT-GSK.docx
@@ -19,7 +19,7 @@
         <w:pStyle w:val="Title"/>
       </w:pPr>
       <w:r>
-        <w:t xml:space="preserve">DT-GSK: Dimension-Tiered Adaptive Configuration Selection and Deterministic Refinement for Gaining-Sharing Knowledge Optimization</w:t>
+        <w:t xml:space="preserve">DT-GSK: Dimension-Tiered Adaptive Configuration Selection and Deterministic Refinement for Gaining-Sharing Knowledge-Based Optimization Algorithm</w:t>
       </w:r>
     </w:p>
     <w:p>
@@ -56,56 +56,6 @@
     </w:p>
     <w:p>
       <w:pPr>
-        <w:pStyle w:val="BodyText"/>
-      </w:pPr>
-      <w:r>
-        <w:rPr>
-          <w:vertAlign w:val="superscript"/>
-        </w:rPr>
-        <w:t xml:space="preserve">1</w:t>
-      </w:r>
-      <w:r>
-        <w:t xml:space="preserve"> Operations Research Department, Faculty of Graduate Studies for</w:t>
-      </w:r>
-      <w:r>
-        <w:t xml:space="preserve"> </w:t>
-      </w:r>
-      <w:r>
-        <w:t xml:space="preserve">Statistical Research, Cairo University, Giza 12613, Egypt;</w:t>
-      </w:r>
-      <w:r>
-        <w:t xml:space="preserve"> </w:t>
-      </w:r>
-      <w:r>
-        <w:t xml:space="preserve">moustafa.masoud@gmail.com (M.E.A.M. ORCID 0009-0003-8415-2158); hmhmdss@yahoo.com (H.S.M.R. ORCID 0000-0003-0387-5876); aliwagdy@gmail.com (A.W.M. ORCID 0000-0002-5895-2632)</w:t>
-      </w:r>
-      <w:r>
-        <w:br/>
-      </w:r>
-      <w:r>
-        <w:rPr>
-          <w:vertAlign w:val="superscript"/>
-        </w:rPr>
-        <w:t xml:space="preserve">2</w:t>
-      </w:r>
-      <w:r>
-        <w:t xml:space="preserve"> University of Science and Technology, Zewail City of Science and</w:t>
-      </w:r>
-      <w:r>
-        <w:t xml:space="preserve"> </w:t>
-      </w:r>
-      <w:r>
-        <w:t xml:space="preserve">Technology, 6th of October City, Giza 12588, Egypt</w:t>
-      </w:r>
-      <w:r>
-        <w:br/>
-      </w:r>
-      <w:r>
-        <w:t xml:space="preserve">* Correspondence: moustafa.masoud@gmail.com</w:t>
-      </w:r>
-    </w:p>
-    <w:p>
-      <w:pPr>
         <w:pStyle w:val="AbstractTitle"/>
       </w:pPr>
       <w:r>
@@ -360,6 +310,62 @@
       </w:r>
       <w:r>
         <w:t xml:space="preserve">All findings are scoped to the GSK-family panel.</w:t>
+      </w:r>
+    </w:p>
+    <w:p>
+      <w:pPr>
+        <w:pStyle w:val="BodyText"/>
+      </w:pPr>
+      <w:r>
+        <w:rPr>
+          <w:vertAlign w:val="superscript"/>
+        </w:rPr>
+        <w:t xml:space="preserve">1</w:t>
+      </w:r>
+      <w:r>
+        <w:t xml:space="preserve"> Department of Operations Research, Faculty of Graduate Studies for</w:t>
+      </w:r>
+      <w:r>
+        <w:t xml:space="preserve"> </w:t>
+      </w:r>
+      <w:r>
+        <w:t xml:space="preserve">Statistical Research, Cairo University, Giza 12613, Egypt;</w:t>
+      </w:r>
+      <w:r>
+        <w:t xml:space="preserve"> </w:t>
+      </w:r>
+      <w:r>
+        <w:t xml:space="preserve">moustafa.masoud@gmail.com (M.E.A.M. ORCID 0009-0003-8415-2158); hmhmdss@yahoo.com (H.S.M.R. ORCID 0000-0003-0387-5876); aliwagdy@gmail.com (A.W.M. ORCID 0000-0002-5895-2632)</w:t>
+      </w:r>
+      <w:r>
+        <w:br/>
+      </w:r>
+      <w:r>
+        <w:rPr>
+          <w:vertAlign w:val="superscript"/>
+        </w:rPr>
+        <w:t xml:space="preserve">2</w:t>
+      </w:r>
+      <w:r>
+        <w:t xml:space="preserve"> University of Science and Technology, Mathematics Program,</w:t>
+      </w:r>
+      <w:r>
+        <w:t xml:space="preserve"> </w:t>
+      </w:r>
+      <w:r>
+        <w:t xml:space="preserve">Zewail City of Science and Technology, October Gardens, 6th of October,</w:t>
+      </w:r>
+      <w:r>
+        <w:t xml:space="preserve"> </w:t>
+      </w:r>
+      <w:r>
+        <w:t xml:space="preserve">Giza 12578, Egypt</w:t>
+      </w:r>
+      <w:r>
+        <w:br/>
+      </w:r>
+      <w:r>
+        <w:t xml:space="preserve">* Correspondence: moustafa.masoud@gmail.com</w:t>
       </w:r>
     </w:p>
     <w:p>

</xml_diff>

<commit_message>
Pass-73 apply: em-dash density reduced in the repository's own sources
The de-dashing had reached the copy returned to the journal, the supplement
and the cover letter, but never main.tex, the five section files or the
plain-language summary. 275 of their 279 printing em-dashes are now commas,
colons, semicolons or parentheses; 14 remain where a dash aids clarity.

Each site was judged against its own sentence rather than find-and-replaced.
Two safeguards earned their keep again: pairs were applied atomically, and
the parenthesis-balance check ABORTED the first run unwritten, having caught
two agents that opened a parenthetical whose closing point carried no dash
and so could never be paired. Both closing halves were supplied by hand
after reading the sentences.

All four artifacts and the plain summary rebuilt; page counts unchanged
(49/82/11); parity 755 rows 0 FAIL; bindings green; no undefined reference.

Co-Authored-By: Claude Opus 5 <noreply@anthropic.com>
</commit_message>
<xml_diff>
--- a/papers/DT-GSK.docx
+++ b/papers/DT-GSK.docx
@@ -208,13 +208,13 @@
         <w:t xml:space="preserve"> </w:t>
       </w:r>
       <w:r>
-        <w:t xml:space="preserve">On AGSK’s strongest suite—the CEC2020 competition in which it was the</w:t>
-      </w:r>
-      <w:r>
-        <w:t xml:space="preserve"> </w:t>
-      </w:r>
-      <w:r>
-        <w:t xml:space="preserve">runner-up—DT-GSK places fourth; the family panel corroborates AGSK’s</w:t>
+        <w:t xml:space="preserve">On AGSK’s strongest suite, the CEC2020 competition in which it was the</w:t>
+      </w:r>
+      <w:r>
+        <w:t xml:space="preserve"> </w:t>
+      </w:r>
+      <w:r>
+        <w:t xml:space="preserve">runner-up, DT-GSK places fourth; the family panel corroborates AGSK’s</w:t>
       </w:r>
       <w:r>
         <w:t xml:space="preserve"> </w:t>
@@ -297,7 +297,7 @@
         <w:t xml:space="preserve"> </w:t>
       </w:r>
       <w:r>
-        <w:t xml:space="preserve">coordinate axes outperform its basis—controlled negative</w:t>
+        <w:t xml:space="preserve">coordinate axes outperform its basis: controlled negative</w:t>
       </w:r>
       <w:r>
         <w:t xml:space="preserve"> </w:t>
@@ -462,7 +462,7 @@
         <w:t xml:space="preserve"> </w:t>
       </w:r>
       <w:r>
-        <w:t xml:space="preserve">budget — no derivatives, a fixed cap on objective evaluations, and</w:t>
+        <w:t xml:space="preserve">budget (no derivatives, a fixed cap on objective evaluations, and</w:t>
       </w:r>
       <w:r>
         <w:t xml:space="preserve"> </w:t>
@@ -474,7 +474,7 @@
         <w:t xml:space="preserve"> </w:t>
       </w:r>
       <w:r>
-        <w:t xml:space="preserve">structure — is the regime that the CEC benchmark protocols</w:t>
+        <w:t xml:space="preserve">structure) is the regime that the CEC benchmark protocols</w:t>
       </w:r>
       <w:r>
         <w:t xml:space="preserve"> </w:t>
@@ -552,13 +552,13 @@
         <w:t xml:space="preserve"> </w:t>
       </w:r>
       <w:r>
-        <w:t xml:space="preserve">This paper follows that prescription. It stays inside one family — the</w:t>
-      </w:r>
-      <w:r>
-        <w:t xml:space="preserve"> </w:t>
-      </w:r>
-      <w:r>
-        <w:t xml:space="preserve">gaining-sharing knowledge (GSK) algorithm and its published descendants —</w:t>
+        <w:t xml:space="preserve">This paper follows that prescription. It stays inside one family, the</w:t>
+      </w:r>
+      <w:r>
+        <w:t xml:space="preserve"> </w:t>
+      </w:r>
+      <w:r>
+        <w:t xml:space="preserve">gaining-sharing knowledge (GSK) algorithm and its published descendants,</w:t>
       </w:r>
       <w:r>
         <w:t xml:space="preserve"> </w:t>
@@ -933,13 +933,13 @@
         <w:t xml:space="preserve"> </w:t>
       </w:r>
       <w:r>
-        <w:t xml:space="preserve">the algorithm proposed here. Brittle fixed control — the family’s</w:t>
-      </w:r>
-      <w:r>
-        <w:t xml:space="preserve"> </w:t>
-      </w:r>
-      <w:r>
-        <w:t xml:space="preserve">founding complaint — is answered by an operator-level, bandit-style</w:t>
+        <w:t xml:space="preserve">the algorithm proposed here. Brittle fixed control, the family’s</w:t>
+      </w:r>
+      <w:r>
+        <w:t xml:space="preserve"> </w:t>
+      </w:r>
+      <w:r>
+        <w:t xml:space="preserve">founding complaint, is answered by an operator-level, bandit-style</w:t>
       </w:r>
       <w:r>
         <w:t xml:space="preserve"> </w:t>
@@ -981,7 +981,7 @@
         <w:t xml:space="preserve"> </w:t>
       </w:r>
       <w:r>
-        <w:t xml:space="preserve">deterministic, one-shot final polish — the deterministic refinement of</w:t>
+        <w:t xml:space="preserve">deterministic, one-shot final polish: the deterministic refinement of</w:t>
       </w:r>
       <w:r>
         <w:t xml:space="preserve"> </w:t>
@@ -993,13 +993,13 @@
         <w:t xml:space="preserve"> </w:t>
       </w:r>
       <w:r>
-        <w:t xml:space="preserve">descendant addresses — recombination that treats every coordinate</w:t>
-      </w:r>
-      <w:r>
-        <w:t xml:space="preserve"> </w:t>
-      </w:r>
-      <w:r>
-        <w:t xml:space="preserve">independently of the run’s own improvement history — is targeted by the</w:t>
+        <w:t xml:space="preserve">descendant addresses (recombination that treats every coordinate</w:t>
+      </w:r>
+      <w:r>
+        <w:t xml:space="preserve"> </w:t>
+      </w:r>
+      <w:r>
+        <w:t xml:space="preserve">independently of the run’s own improvement history) is targeted by the</w:t>
       </w:r>
       <w:r>
         <w:t xml:space="preserve"> </w:t>
@@ -1031,7 +1031,7 @@
         <w:t xml:space="preserve"> </w:t>
       </w:r>
       <w:r>
-        <w:t xml:space="preserve">population’s composition. Within that cited family — surveyed in</w:t>
+        <w:t xml:space="preserve">population’s composition. Within that cited family (surveyed in</w:t>
       </w:r>
       <w:r>
         <w:t xml:space="preserve"> </w:t>
@@ -1061,7 +1061,7 @@
         <w:t xml:space="preserve"> </w:t>
       </w:r>
       <w:r>
-        <w:t xml:space="preserve">comparison panel — none learns — or exploits —</w:t>
+        <w:t xml:space="preserve">comparison panel), none learns, or exploits,</w:t>
       </w:r>
       <w:r>
         <w:t xml:space="preserve"> </w:t>
@@ -1204,7 +1204,7 @@
           <w:b/>
           <w:bCs/>
         </w:rPr>
-        <w:t xml:space="preserve">C1 — a deterministic final polish.</w:t>
+        <w:t xml:space="preserve">C1: a deterministic final polish.</w:t>
       </w:r>
       <w:r>
         <w:t xml:space="preserve"> </w:t>
@@ -1507,7 +1507,7 @@
           <w:b/>
           <w:bCs/>
         </w:rPr>
-        <w:t xml:space="preserve">C2 — a dimension-tiered adaptive scaffold.</w:t>
+        <w:t xml:space="preserve">C2: a dimension-tiered adaptive scaffold.</w:t>
       </w:r>
       <w:r>
         <w:t xml:space="preserve"> </w:t>
@@ -1543,13 +1543,13 @@
         <w:t xml:space="preserve"> </w:t>
       </w:r>
       <w:r>
-        <w:t xml:space="preserve">— a variant of the APGSK NLPSR schedule, explicitly not claimed</w:t>
-      </w:r>
-      <w:r>
-        <w:t xml:space="preserve"> </w:t>
-      </w:r>
-      <w:r>
-        <w:t xml:space="preserve">as new; a hard-capped Budget-Safe Escape (BSE) seeded from a distance-filtered</w:t>
+        <w:t xml:space="preserve">(a variant of the APGSK NLPSR schedule, explicitly not claimed</w:t>
+      </w:r>
+      <w:r>
+        <w:t xml:space="preserve"> </w:t>
+      </w:r>
+      <w:r>
+        <w:t xml:space="preserve">as new); a hard-capped Budget-Safe Escape (BSE) seeded from a distance-filtered</w:t>
       </w:r>
       <w:r>
         <w:t xml:space="preserve"> </w:t>
@@ -1699,7 +1699,7 @@
           <w:b/>
           <w:bCs/>
         </w:rPr>
-        <w:t xml:space="preserve">C3 — a controlled, reproducible family evaluation.</w:t>
+        <w:t xml:space="preserve">C3: a controlled, reproducible family evaluation.</w:t>
       </w:r>
       <w:r>
         <w:t xml:space="preserve"> </w:t>
@@ -1753,7 +1753,7 @@
         <w:t xml:space="preserve"> </w:t>
       </w:r>
       <w:r>
-        <w:t xml:space="preserve">against the original GSK and its five published descendants —</w:t>
+        <w:t xml:space="preserve">against the original GSK and its five published descendants (</w:t>
       </w:r>
       <w:r>
         <w:t xml:space="preserve"> </w:t>
@@ -1777,7 +1777,7 @@
         <w:t xml:space="preserve"> </w:t>
       </w:r>
       <w:r>
-        <w:t xml:space="preserve">than quoted from its source publication — on five suites: the CEC2017</w:t>
+        <w:t xml:space="preserve">than quoted from its source publication) on five suites: the CEC2017</w:t>
       </w:r>
       <w:r>
         <w:t xml:space="preserve"> </w:t>
@@ -1813,7 +1813,7 @@
         <w:t xml:space="preserve"> </w:t>
       </w:r>
       <w:r>
-        <w:t xml:space="preserve">omission — one code base, one budget protocol, and one evaluation</w:t>
+        <w:t xml:space="preserve">omission: one code base, one budget protocol, and one evaluation</w:t>
       </w:r>
       <w:r>
         <w:t xml:space="preserve"> </w:t>
@@ -2105,13 +2105,13 @@
         <w:t xml:space="preserve"> </w:t>
       </w:r>
       <w:r>
-        <w:t xml:space="preserve">to move — rates,</w:t>
-      </w:r>
-      <w:r>
-        <w:t xml:space="preserve"> </w:t>
-      </w:r>
-      <w:r>
-        <w:t xml:space="preserve">probabilities, population size — while the question of</w:t>
+        <w:t xml:space="preserve">to move (rates,</w:t>
+      </w:r>
+      <w:r>
+        <w:t xml:space="preserve"> </w:t>
+      </w:r>
+      <w:r>
+        <w:t xml:space="preserve">probabilities, population size), while the question of</w:t>
       </w:r>
       <w:r>
         <w:t xml:space="preserve"> </w:t>
@@ -2159,13 +2159,13 @@
         <w:t xml:space="preserve"> </w:t>
       </w:r>
       <w:r>
-        <w:t xml:space="preserve">covariance. That gap — scalar control inside the family, evaluation-hungry</w:t>
-      </w:r>
-      <w:r>
-        <w:t xml:space="preserve"> </w:t>
-      </w:r>
-      <w:r>
-        <w:t xml:space="preserve">structure learning outside it — is what the following comparison</w:t>
+        <w:t xml:space="preserve">covariance. That gap (scalar control inside the family, evaluation-hungry</w:t>
+      </w:r>
+      <w:r>
+        <w:t xml:space="preserve"> </w:t>
+      </w:r>
+      <w:r>
+        <w:t xml:space="preserve">structure learning outside it) is what the following comparison</w:t>
       </w:r>
       <w:r>
         <w:t xml:space="preserve"> </w:t>
@@ -2415,7 +2415,7 @@
         </m:r>
       </m:oMath>
       <w:r>
-        <w:t xml:space="preserve">) — the limitation that later</w:t>
+        <w:t xml:space="preserve">), the limitation that later</w:t>
       </w:r>
       <w:r>
         <w:t xml:space="preserve"> </w:t>
@@ -2828,7 +2828,7 @@
         <w:t xml:space="preserve"> </w:t>
       </w:r>
       <w:r>
-        <w:t xml:space="preserve">budget — one tenth of the standard protocol —</w:t>
+        <w:t xml:space="preserve">budget, one tenth of the standard protocol,</w:t>
       </w:r>
       <w:r>
         <w:t xml:space="preserve"> </w:t>
@@ -3127,7 +3127,7 @@
         <w:t xml:space="preserve"> </w:t>
       </w:r>
       <w:r>
-        <w:t xml:space="preserve">produced improvement — a hyperparameter memory; it carries no</w:t>
+        <w:t xml:space="preserve">produced improvement: a hyperparameter memory; it carries no</w:t>
       </w:r>
       <w:r>
         <w:t xml:space="preserve"> </w:t>
@@ -3736,13 +3736,13 @@
         <w:t xml:space="preserve"> </w:t>
       </w:r>
       <w:r>
-        <w:t xml:space="preserve">operator. Within the cited GSK family, none of these variants learns —</w:t>
-      </w:r>
-      <w:r>
-        <w:t xml:space="preserve"> </w:t>
-      </w:r>
-      <w:r>
-        <w:t xml:space="preserve">or exploits — the interaction structure of the moves the run has</w:t>
+        <w:t xml:space="preserve">operator. Within the cited GSK family, none of these variants learns,</w:t>
+      </w:r>
+      <w:r>
+        <w:t xml:space="preserve"> </w:t>
+      </w:r>
+      <w:r>
+        <w:t xml:space="preserve">or exploits, the interaction structure of the moves the run has</w:t>
       </w:r>
       <w:r>
         <w:t xml:space="preserve"> </w:t>
@@ -4787,13 +4787,13 @@
         <w:t xml:space="preserve"> </w:t>
       </w:r>
       <w:r>
-        <w:t xml:space="preserve">the GSK family. The approaches separate on four axes — update trigger,</w:t>
-      </w:r>
-      <w:r>
-        <w:t xml:space="preserve"> </w:t>
-      </w:r>
-      <w:r>
-        <w:t xml:space="preserve">evaluation cost, what is learned, and how it is exploited — on which</w:t>
+        <w:t xml:space="preserve">the GSK family. The approaches separate on four axes (update trigger,</w:t>
+      </w:r>
+      <w:r>
+        <w:t xml:space="preserve"> </w:t>
+      </w:r>
+      <w:r>
+        <w:t xml:space="preserve">evaluation cost, what is learned, and how it is exploited) on which</w:t>
       </w:r>
       <w:r>
         <w:t xml:space="preserve"> </w:t>
@@ -5025,13 +5025,13 @@
         <w:t xml:space="preserve"> </w:t>
       </w:r>
       <w:r>
-        <w:t xml:space="preserve">population covariance each generation — an instantaneous statistic, not a</w:t>
-      </w:r>
-      <w:r>
-        <w:t xml:space="preserve"> </w:t>
-      </w:r>
-      <w:r>
-        <w:t xml:space="preserve">cumulative memory — at</w:t>
+        <w:t xml:space="preserve">population covariance each generation (an instantaneous statistic, not a</w:t>
+      </w:r>
+      <w:r>
+        <w:t xml:space="preserve"> </w:t>
+      </w:r>
+      <w:r>
+        <w:t xml:space="preserve">cumulative memory) at</w:t>
       </w:r>
       <w:r>
         <w:t xml:space="preserve"> </w:t>
@@ -5236,13 +5236,13 @@
         <w:t xml:space="preserve"> </w:t>
       </w:r>
       <w:r>
-        <w:t xml:space="preserve">It spends no additional objective evaluations — it learns from evaluations the</w:t>
-      </w:r>
-      <w:r>
-        <w:t xml:space="preserve"> </w:t>
-      </w:r>
-      <w:r>
-        <w:t xml:space="preserve">run already made — at a compute-only cost of a per-generation</w:t>
+        <w:t xml:space="preserve">It spends no additional objective evaluations (it learns from evaluations the</w:t>
+      </w:r>
+      <w:r>
+        <w:t xml:space="preserve"> </w:t>
+      </w:r>
+      <w:r>
+        <w:t xml:space="preserve">run already made) at a compute-only cost of a per-generation</w:t>
       </w:r>
       <w:r>
         <w:t xml:space="preserve"> </w:t>
@@ -5516,7 +5516,7 @@
         <w:t xml:space="preserve"> </w:t>
       </w:r>
       <w:r>
-        <w:t xml:space="preserve">standing is not attributed to it — in either direction —</w:t>
+        <w:t xml:space="preserve">standing is not attributed to it, in either direction,</w:t>
       </w:r>
       <w:r>
         <w:t xml:space="preserve"> </w:t>
@@ -6031,7 +6031,7 @@
               <w:jc w:val="left"/>
             </w:pPr>
             <w:r>
-              <w:t xml:space="preserve">no extra evaluations — learns from evaluations already made; sparse updates, one terminal eigendecomposition</w:t>
+              <w:t xml:space="preserve">no extra evaluations (learns from evaluations already made); sparse updates, one terminal eigendecomposition</w:t>
             </w:r>
           </w:p>
         </w:tc>
@@ -6064,7 +6064,7 @@
               <w:jc w:val="left"/>
             </w:pPr>
             <w:r>
-              <w:t xml:space="preserve">pairwise non-separability decisions — a hard variable partition</w:t>
+              <w:t xml:space="preserve">pairwise non-separability decisions: a hard variable partition</w:t>
             </w:r>
           </w:p>
         </w:tc>
@@ -6076,7 +6076,7 @@
               <w:jc w:val="left"/>
             </w:pPr>
             <w:r>
-              <w:t xml:space="preserve">full mutation covariance — a complete sampling-distribution shape</w:t>
+              <w:t xml:space="preserve">full mutation covariance: a complete sampling-distribution shape</w:t>
             </w:r>
           </w:p>
         </w:tc>
@@ -6088,7 +6088,7 @@
               <w:jc w:val="left"/>
             </w:pPr>
             <w:r>
-              <w:t xml:space="preserve">eigenbasis of the population covariance — instantaneous geometry</w:t>
+              <w:t xml:space="preserve">eigenbasis of the population covariance: instantaneous geometry</w:t>
             </w:r>
           </w:p>
         </w:tc>
@@ -6100,7 +6100,7 @@
               <w:jc w:val="left"/>
             </w:pPr>
             <w:r>
-              <w:t xml:space="preserve">weighted, signed coordinate-pair graph — soft, decaying evidence (not a hard partition)</w:t>
+              <w:t xml:space="preserve">weighted, signed coordinate-pair graph: soft, decaying evidence (not a hard partition)</w:t>
             </w:r>
           </w:p>
         </w:tc>
@@ -6320,13 +6320,13 @@
         <w:t xml:space="preserve"> </w:t>
       </w:r>
       <w:r>
-        <w:t xml:space="preserve">cited in this paper — a bounded review of the GSK lineage rather than an</w:t>
-      </w:r>
-      <w:r>
-        <w:t xml:space="preserve"> </w:t>
-      </w:r>
-      <w:r>
-        <w:t xml:space="preserve">exhaustive systematic search of the wider metaheuristic literature — none</w:t>
+        <w:t xml:space="preserve">cited in this paper (a bounded review of the GSK lineage rather than an</w:t>
+      </w:r>
+      <w:r>
+        <w:t xml:space="preserve"> </w:t>
+      </w:r>
+      <w:r>
+        <w:t xml:space="preserve">exhaustive systematic search of the wider metaheuristic literature), none</w:t>
       </w:r>
       <w:r>
         <w:t xml:space="preserve"> </w:t>
@@ -6368,13 +6368,13 @@
         <w:t xml:space="preserve"> </w:t>
       </w:r>
       <w:r>
-        <w:t xml:space="preserve">each, we inspected the stated adaptation target — control parameters,</w:t>
-      </w:r>
-      <w:r>
-        <w:t xml:space="preserve"> </w:t>
-      </w:r>
-      <w:r>
-        <w:t xml:space="preserve">donor/selection policy, or population sizing — for any online,</w:t>
+        <w:t xml:space="preserve">each, we inspected the stated adaptation target (control parameters,</w:t>
+      </w:r>
+      <w:r>
+        <w:t xml:space="preserve"> </w:t>
+      </w:r>
+      <w:r>
+        <w:t xml:space="preserve">donor/selection policy, or population sizing) for any online,</w:t>
       </w:r>
       <w:r>
         <w:t xml:space="preserve"> </w:t>
@@ -6398,7 +6398,7 @@
         <w:t xml:space="preserve"> </w:t>
       </w:r>
       <w:r>
-        <w:t xml:space="preserve">DT-GSK’s interaction-structure memory and its two active consumers —</w:t>
+        <w:t xml:space="preserve">DT-GSK’s interaction-structure memory and its two active consumers,</w:t>
       </w:r>
       <w:r>
         <w:t xml:space="preserve"> </w:t>
@@ -6416,7 +6416,7 @@
         <w:t xml:space="preserve"> </w:t>
       </w:r>
       <w:r>
-        <w:t xml:space="preserve">in the frozen configuration) — are designed for exactly this quantity.</w:t>
+        <w:t xml:space="preserve">in the frozen configuration), are designed for exactly this quantity.</w:t>
       </w:r>
     </w:p>
     <w:p>
@@ -10122,7 +10122,7 @@
         <w:pStyle w:val="BodyText"/>
       </w:pPr>
       <w:r>
-        <w:t xml:space="preserve">These four elements — the junior/senior operator with its index</w:t>
+        <w:t xml:space="preserve">These four elements (the junior/senior operator with its index</w:t>
       </w:r>
       <w:r>
         <w:t xml:space="preserve"> </w:t>
@@ -10134,7 +10134,7 @@
         <w:t xml:space="preserve"> </w:t>
       </w:r>
       <w:r>
-        <w:t xml:space="preserve">the greedy selection — are inherited from their cited</w:t>
+        <w:t xml:space="preserve">the greedy selection) are inherited from their cited</w:t>
       </w:r>
       <w:r>
         <w:t xml:space="preserve"> </w:t>
@@ -17083,13 +17083,13 @@
         <w:t xml:space="preserve"> </w:t>
       </w:r>
       <w:r>
-        <w:t xml:space="preserve">large-scale exception — two linkage-block-size entries for</w:t>
-      </w:r>
-      <w:r>
-        <w:t xml:space="preserve"> </w:t>
-      </w:r>
-      <w:r>
-        <w:t xml:space="preserve">CEC2013LSGO’s native dimensions — is disclosed in</w:t>
+        <w:t xml:space="preserve">large-scale exception (two linkage-block-size entries for</w:t>
+      </w:r>
+      <w:r>
+        <w:t xml:space="preserve"> </w:t>
+      </w:r>
+      <w:r>
+        <w:t xml:space="preserve">CEC2013LSGO’s native dimensions) is disclosed in</w:t>
       </w:r>
       <w:r>
         <w:t xml:space="preserve"> </w:t>
@@ -17273,13 +17273,13 @@
         <w:t xml:space="preserve"> </w:t>
       </w:r>
       <w:r>
-        <w:t xml:space="preserve">objective evaluation — trials, escapes, local-search and polish probes,</w:t>
-      </w:r>
-      <w:r>
-        <w:t xml:space="preserve"> </w:t>
-      </w:r>
-      <w:r>
-        <w:t xml:space="preserve">restart resamples — is charged through one budget controller, and all</w:t>
+        <w:t xml:space="preserve">objective evaluation (trials, escapes, local-search and polish probes,</w:t>
+      </w:r>
+      <w:r>
+        <w:t xml:space="preserve"> </w:t>
+      </w:r>
+      <w:r>
+        <w:t xml:space="preserve">restart resamples) is charged through one budget controller, and all</w:t>
       </w:r>
       <w:r>
         <w:t xml:space="preserve"> </w:t>
@@ -17323,7 +17323,7 @@
         <w:tblStyle w:val="Table"/>
         <w:tblW w:type="auto" w:w="0"/>
         <w:tblLook w:firstRow="1" w:lastRow="0" w:firstColumn="0" w:lastColumn="0" w:noHBand="0" w:noVBand="0" w:val="0020"/>
-        <w:tblCaption w:val="Architecture of DT-GSK: the eight subsystems composed around the unchanged GSK vector-update operator, with each subsystem’s category (inherited / scaffold / dimension-gated), active tier, and role. Every objective evaluation — trials, escapes, local-search and polish probes, restart resamples — is charged through one budget controller, and all randomness draws from the 13-substream RNG rail (Eq. (13)); the deep-stall restart preserves the global best."/>
+        <w:tblCaption w:val="Architecture of DT-GSK: the eight subsystems composed around the unchanged GSK vector-update operator, with each subsystem’s category (inherited / scaffold / dimension-gated), active tier, and role. Every objective evaluation (trials, escapes, local-search and polish probes, restart resamples) is charged through one budget controller, and all randomness draws from the 13-substream RNG rail (Eq. (13)); the deep-stall restart preserves the global best."/>
       </w:tblPr>
       <w:tblGrid>
         <w:gridCol w:w="1980"/>
@@ -18305,7 +18305,7 @@
         <w:t xml:space="preserve"> </w:t>
       </w:r>
       <w:r>
-        <w:t xml:space="preserve">at every dimension — the setting of the family’s</w:t>
+        <w:t xml:space="preserve">at every dimension (the setting of the family’s</w:t>
       </w:r>
       <w:r>
         <w:t xml:space="preserve"> </w:t>
@@ -18323,7 +18323,7 @@
         <w:t xml:space="preserve"> </w:t>
       </w:r>
       <w:r>
-        <w:t xml:space="preserve">papers — whereas DT-GSK initializes</w:t>
+        <w:t xml:space="preserve">papers), whereas DT-GSK initializes</w:t>
       </w:r>
       <w:r>
         <w:t xml:space="preserve"> </w:t>
@@ -18780,7 +18780,7 @@
         <w:t xml:space="preserve"> </w:t>
       </w:r>
       <w:r>
-        <w:t xml:space="preserve">generation around them is not—crossover masking, tie handling, the population</w:t>
+        <w:t xml:space="preserve">generation around them is not: crossover masking, tie handling, the population</w:t>
       </w:r>
       <w:r>
         <w:t xml:space="preserve"> </w:t>
@@ -20520,7 +20520,7 @@
         <w:t xml:space="preserve"> </w:t>
       </w:r>
       <w:r>
-        <w:t xml:space="preserve">upper-tier controllers are cross-cutting—they act inside the reduction, trial-construction, acceptance and escape steps above and gate the local search—as detailed in Section </w:t>
+        <w:t xml:space="preserve">upper-tier controllers are cross-cutting (they act inside the reduction, trial-construction, acceptance and escape steps above and gate the local search) as detailed in Section </w:t>
       </w:r>
       <w:r>
         <w:fldChar w:fldCharType="begin"/>
@@ -20874,7 +20874,7 @@
         <w:t xml:space="preserve"> </w:t>
       </w:r>
       <w:r>
-        <w:t xml:space="preserve">the upper-tier controllers are cross-cutting rather than a single stage — they act within the population-reduction, trial-construction, acceptance, and escape steps above (and gate the local search) — so they are not drawn as a separate node. The global best is preserved</w:t>
+        <w:t xml:space="preserve">the upper-tier controllers are cross-cutting rather than a single stage: they act within the population-reduction, trial-construction, acceptance, and escape steps above (and gate the local search), so they are not drawn as a separate node. The global best is preserved</w:t>
       </w:r>
       <w:r>
         <w:t xml:space="preserve"> </w:t>
@@ -21237,13 +21237,13 @@
         <w:t xml:space="preserve"> </w:t>
       </w:r>
       <w:r>
-        <w:t xml:space="preserve">working population — it cannot return a population whose best is worse</w:t>
-      </w:r>
-      <w:r>
-        <w:t xml:space="preserve"> </w:t>
-      </w:r>
-      <w:r>
-        <w:t xml:space="preserve">than the incumbent it was given — with one deliberate exception: the</w:t>
+        <w:t xml:space="preserve">working population (it cannot return a population whose best is worse</w:t>
+      </w:r>
+      <w:r>
+        <w:t xml:space="preserve"> </w:t>
+      </w:r>
+      <w:r>
+        <w:t xml:space="preserve">than the incumbent it was given), with one deliberate exception: the</w:t>
       </w:r>
       <w:r>
         <w:t xml:space="preserve"> </w:t>
@@ -23609,13 +23609,13 @@
         <w:t xml:space="preserve"> </w:t>
       </w:r>
       <w:r>
-        <w:t xml:space="preserve">memory’s active tiers. The dimension-tiering itself — resolving control</w:t>
-      </w:r>
-      <w:r>
-        <w:t xml:space="preserve"> </w:t>
-      </w:r>
-      <w:r>
-        <w:t xml:space="preserve">by dimension rather than at a single fixed operating point — is likewise</w:t>
+        <w:t xml:space="preserve">memory’s active tiers. The dimension-tiering itself, resolving control</w:t>
+      </w:r>
+      <w:r>
+        <w:t xml:space="preserve"> </w:t>
+      </w:r>
+      <w:r>
+        <w:t xml:space="preserve">by dimension rather than at a single fixed operating point, is likewise</w:t>
       </w:r>
       <w:r>
         <w:t xml:space="preserve"> </w:t>
@@ -26028,10 +26028,7 @@
         </m:sSub>
       </m:oMath>
       <w:r>
-        <w:t xml:space="preserve"> </w:t>
-      </w:r>
-      <w:r>
-        <w:t xml:space="preserve">— the summed</w:t>
+        <w:t xml:space="preserve">: the summed</w:t>
       </w:r>
       <w:r>
         <w:t xml:space="preserve"> </w:t>
@@ -26291,13 +26288,13 @@
         <w:t xml:space="preserve"> </w:t>
       </w:r>
       <w:r>
-        <w:t xml:space="preserve">individually improved. When no arm improves — or the aggregate is</w:t>
-      </w:r>
-      <w:r>
-        <w:t xml:space="preserve"> </w:t>
-      </w:r>
-      <w:r>
-        <w:t xml:space="preserve">exactly zero —</w:t>
+        <w:t xml:space="preserve">individually improved. When no arm improves, or the aggregate is</w:t>
+      </w:r>
+      <w:r>
+        <w:t xml:space="preserve"> </w:t>
+      </w:r>
+      <w:r>
+        <w:t xml:space="preserve">exactly zero,</w:t>
       </w:r>
       <w:r>
         <w:t xml:space="preserve"> </w:t>
@@ -28248,7 +28245,7 @@
         <w:fldChar w:fldCharType="end"/>
       </w:r>
       <w:r>
-        <w:t xml:space="preserve">), sparing the frozen elite —</w:t>
+        <w:t xml:space="preserve">), sparing the frozen elite:</w:t>
       </w:r>
       <w:r>
         <w:t xml:space="preserve"> </w:t>
@@ -28319,13 +28316,13 @@
         <w:t xml:space="preserve"> </w:t>
       </w:r>
       <w:r>
-        <w:t xml:space="preserve">qualifier; a successful rescue — one that</w:t>
-      </w:r>
-      <w:r>
-        <w:t xml:space="preserve"> </w:t>
-      </w:r>
-      <w:r>
-        <w:t xml:space="preserve">lowers the incumbent best — cancels the restart for that generation, and</w:t>
+        <w:t xml:space="preserve">qualifier; a successful rescue, one that</w:t>
+      </w:r>
+      <w:r>
+        <w:t xml:space="preserve"> </w:t>
+      </w:r>
+      <w:r>
+        <w:t xml:space="preserve">lowers the incumbent best, cancels the restart for that generation, and</w:t>
       </w:r>
       <w:r>
         <w:t xml:space="preserve"> </w:t>
@@ -29995,13 +29992,13 @@
         <w:t xml:space="preserve"> </w:t>
       </w:r>
       <w:r>
-        <w:t xml:space="preserve">budget of pairwise-probing objective evaluations — quadratic in the</w:t>
-      </w:r>
-      <w:r>
-        <w:t xml:space="preserve"> </w:t>
-      </w:r>
-      <w:r>
-        <w:t xml:space="preserve">dimension — before optimization starts </w:t>
+        <w:t xml:space="preserve">budget of pairwise-probing objective evaluations, quadratic in the</w:t>
+      </w:r>
+      <w:r>
+        <w:t xml:space="preserve"> </w:t>
+      </w:r>
+      <w:r>
+        <w:t xml:space="preserve">dimension, before optimization starts </w:t>
       </w:r>
       <w:r>
         <w:fldChar w:fldCharType="begin"/>
@@ -30746,7 +30743,7 @@
         <w:t xml:space="preserve"> </w:t>
       </w:r>
       <w:r>
-        <w:t xml:space="preserve">re-extracted every 5 generations — at</w:t>
+        <w:t xml:space="preserve">re-extracted every 5 generations (at</w:t>
       </w:r>
       <w:r>
         <w:t xml:space="preserve"> </w:t>
@@ -30772,7 +30769,7 @@
         <w:t xml:space="preserve"> </w:t>
       </w:r>
       <w:r>
-        <w:t xml:space="preserve">generations respectively — after a warm-up of 0.10 of the</w:t>
+        <w:t xml:space="preserve">generations respectively) after a warm-up of 0.10 of the</w:t>
       </w:r>
       <w:r>
         <w:t xml:space="preserve"> </w:t>
@@ -30889,7 +30886,7 @@
         <w:fldChar w:fldCharType="end"/>
       </w:r>
       <w:r>
-        <w:t xml:space="preserve"> operates on its eigenbasis — a</w:t>
+        <w:t xml:space="preserve"> operates on its eigenbasis, a</w:t>
       </w:r>
       <w:r>
         <w:t xml:space="preserve"> </w:t>
@@ -30907,7 +30904,7 @@
         <w:t xml:space="preserve"> </w:t>
       </w:r>
       <w:r>
-        <w:t xml:space="preserve">accumulated only from strictly-improving accepted moves — ties and DE-arm</w:t>
+        <w:t xml:space="preserve">accumulated only from strictly-improving accepted moves (ties and DE-arm</w:t>
       </w:r>
       <w:r>
         <w:t xml:space="preserve"> </w:t>
@@ -30924,10 +30921,7 @@
         </m:r>
       </m:oMath>
       <w:r>
-        <w:t xml:space="preserve"> </w:t>
-      </w:r>
-      <w:r>
-        <w:t xml:space="preserve">— then held</w:t>
+        <w:t xml:space="preserve">), then held</w:t>
       </w:r>
       <w:r>
         <w:t xml:space="preserve"> </w:t>
@@ -31453,7 +31447,7 @@
         <w:t xml:space="preserve"> </w:t>
       </w:r>
       <w:r>
-        <w:t xml:space="preserve">channel — an ISM-block subspace local search — is implemented but not</w:t>
+        <w:t xml:space="preserve">channel, an ISM-block subspace local search, is implemented but not</w:t>
       </w:r>
       <w:r>
         <w:t xml:space="preserve"> </w:t>
@@ -31471,7 +31465,7 @@
         <w:t xml:space="preserve"> </w:t>
       </w:r>
       <w:r>
-        <w:t xml:space="preserve">tier-dependent fraction of the population — about</w:t>
+        <w:t xml:space="preserve">tier-dependent fraction of the population, about</w:t>
       </w:r>
       <w:r>
         <w:t xml:space="preserve"> </w:t>
@@ -31553,10 +31547,7 @@
         </m:r>
       </m:oMath>
       <w:r>
-        <w:t xml:space="preserve"> </w:t>
-      </w:r>
-      <w:r>
-        <w:t xml:space="preserve">— the per-coordinate</w:t>
+        <w:t xml:space="preserve">, the per-coordinate</w:t>
       </w:r>
       <w:r>
         <w:t xml:space="preserve"> </w:t>
@@ -31706,7 +31697,7 @@
         <w:t xml:space="preserve"> </w:t>
       </w:r>
       <w:r>
-        <w:t xml:space="preserve">the blocks are random groups of size 5 — a</w:t>
+        <w:t xml:space="preserve">the blocks are random groups of size 5, a</w:t>
       </w:r>
       <w:r>
         <w:t xml:space="preserve"> </w:t>
@@ -32023,7 +32014,7 @@
         <w:t xml:space="preserve"> </w:t>
       </w:r>
       <w:r>
-        <w:t xml:space="preserve">lines — online accepted-move updates, no extra objective evaluations,</w:t>
+        <w:t xml:space="preserve">lines (online accepted-move updates, no extra objective evaluations,</w:t>
       </w:r>
       <w:r>
         <w:t xml:space="preserve"> </w:t>
@@ -32035,7 +32026,7 @@
         <w:t xml:space="preserve"> </w:t>
       </w:r>
       <w:r>
-        <w:t xml:space="preserve">sampling covariance, and discrete exploitation — is developed in</w:t>
+        <w:t xml:space="preserve">sampling covariance, and discrete exploitation) is developed in</w:t>
       </w:r>
       <w:r>
         <w:t xml:space="preserve"> </w:t>
@@ -32507,7 +32498,7 @@
               <w:jc w:val="left"/>
             </w:pPr>
             <w:r>
-              <w:t xml:space="preserve">Two co-evolving accumulators — a magnitude graph</w:t>
+              <w:t xml:space="preserve">Two co-evolving accumulators, a magnitude graph</w:t>
             </w:r>
             <w:r>
               <w:t xml:space="preserve"> </w:t>
@@ -32598,10 +32589,7 @@
               </m:sSub>
             </m:oMath>
             <w:r>
-              <w:t xml:space="preserve"> </w:t>
-            </w:r>
-            <w:r>
-              <w:t xml:space="preserve">— share</w:t>
+              <w:t xml:space="preserve">, share</w:t>
             </w:r>
             <w:r>
               <w:t xml:space="preserve"> </w:t>
@@ -33444,13 +33432,13 @@
         <w:t xml:space="preserve"> </w:t>
       </w:r>
       <w:r>
-        <w:t xml:space="preserve">numbers, so the random-number substreams — and hence the run up to</w:t>
-      </w:r>
-      <w:r>
-        <w:t xml:space="preserve"> </w:t>
-      </w:r>
-      <w:r>
-        <w:t xml:space="preserve">the final budget slice — are byte-identical whether it fires or not.</w:t>
+        <w:t xml:space="preserve">numbers, so the random-number substreams, and hence the run up to</w:t>
+      </w:r>
+      <w:r>
+        <w:t xml:space="preserve"> </w:t>
+      </w:r>
+      <w:r>
+        <w:t xml:space="preserve">the final budget slice, are byte-identical whether it fires or not.</w:t>
       </w:r>
       <w:r>
         <w:t xml:space="preserve"> </w:t>
@@ -34166,13 +34154,13 @@
         <w:t xml:space="preserve"> </w:t>
       </w:r>
       <w:r>
-        <w:t xml:space="preserve">— native dimensions outside the shipped tier</w:t>
-      </w:r>
-      <w:r>
-        <w:t xml:space="preserve"> </w:t>
-      </w:r>
-      <w:r>
-        <w:t xml:space="preserve">table — set to the benchmark’s declared group size of 50 rather than</w:t>
+        <w:t xml:space="preserve">(native dimensions outside the shipped tier</w:t>
+      </w:r>
+      <w:r>
+        <w:t xml:space="preserve"> </w:t>
+      </w:r>
+      <w:r>
+        <w:t xml:space="preserve">table), set to the benchmark’s declared group size of 50 rather than</w:t>
       </w:r>
       <w:r>
         <w:t xml:space="preserve"> </w:t>
@@ -35331,7 +35319,7 @@
         <w:t xml:space="preserve"> </w:t>
       </w:r>
       <w:r>
-        <w:t xml:space="preserve">reference implementation’s MATLAB fmincon (SQP) polish — the panel column is</w:t>
+        <w:t xml:space="preserve">reference implementation’s MATLAB fmincon (SQP) polish: the panel column is</w:t>
       </w:r>
       <w:r>
         <w:t xml:space="preserve"> </w:t>
@@ -36129,13 +36117,13 @@
         <w:t xml:space="preserve"> </w:t>
       </w:r>
       <w:r>
-        <w:t xml:space="preserve">read programmatically from the shipped optimizer modules — module</w:t>
-      </w:r>
-      <w:r>
-        <w:t xml:space="preserve"> </w:t>
-      </w:r>
-      <w:r>
-        <w:t xml:space="preserve">constants imported, runner-visible defaults extracted from source —</w:t>
+        <w:t xml:space="preserve">read programmatically from the shipped optimizer modules (module</w:t>
+      </w:r>
+      <w:r>
+        <w:t xml:space="preserve"> </w:t>
+      </w:r>
+      <w:r>
+        <w:t xml:space="preserve">constants imported, runner-visible defaults extracted from source),</w:t>
       </w:r>
       <w:r>
         <w:t xml:space="preserve"> </w:t>
@@ -36195,7 +36183,7 @@
         <w:t xml:space="preserve"> </w:t>
       </w:r>
       <w:r>
-        <w:t xml:space="preserve">documented per-suite exception — the two CEC2013LSGO linkage-block</w:t>
+        <w:t xml:space="preserve">documented per-suite exception, the two CEC2013LSGO linkage-block</w:t>
       </w:r>
       <w:r>
         <w:t xml:space="preserve"> </w:t>
@@ -36238,7 +36226,7 @@
         </m:r>
       </m:oMath>
       <w:r>
-        <w:t xml:space="preserve">) — is disclosed in</w:t>
+        <w:t xml:space="preserve">), is disclosed in</w:t>
       </w:r>
       <w:r>
         <w:t xml:space="preserve"> </w:t>
@@ -36624,7 +36612,7 @@
         <w:t xml:space="preserve"> </w:t>
       </w:r>
       <w:r>
-        <w:t xml:space="preserve">Because each subsystem draws from its own named substream — with a</w:t>
+        <w:t xml:space="preserve">Because each subsystem draws from its own named substream (with a</w:t>
       </w:r>
       <w:r>
         <w:t xml:space="preserve"> </w:t>
@@ -36636,7 +36624,7 @@
         <w:t xml:space="preserve"> </w:t>
       </w:r>
       <w:r>
-        <w:t xml:space="preserve">the budget-safe-escape substream — toggling a subsystem cannot</w:t>
+        <w:t xml:space="preserve">the budget-safe-escape substream), toggling a subsystem cannot</w:t>
       </w:r>
       <w:r>
         <w:t xml:space="preserve"> </w:t>
@@ -37811,7 +37799,7 @@
         <w:t xml:space="preserve"> </w:t>
       </w:r>
       <w:r>
-        <w:t xml:space="preserve">population family at every tier —</w:t>
+        <w:t xml:space="preserve">population family at every tier (</w:t>
       </w:r>
       <w:r>
         <w:t xml:space="preserve"> </w:t>
@@ -37900,10 +37888,7 @@
         </m:r>
       </m:oMath>
       <w:r>
-        <w:t xml:space="preserve"> </w:t>
-      </w:r>
-      <w:r>
-        <w:t xml:space="preserve">— which at</w:t>
+        <w:t xml:space="preserve">), which at</w:t>
       </w:r>
       <w:r>
         <w:t xml:space="preserve"> </w:t>
@@ -38168,10 +38153,7 @@
         </m:r>
       </m:oMath>
       <w:r>
-        <w:t xml:space="preserve"> </w:t>
-      </w:r>
-      <w:r>
-        <w:t xml:space="preserve">— a minority of the live footprint even where it is largest. Alongside</w:t>
+        <w:t xml:space="preserve">, a minority of the live footprint even where it is largest. Alongside</w:t>
       </w:r>
       <w:r>
         <w:t xml:space="preserve"> </w:t>
@@ -38291,7 +38273,7 @@
         <w:t xml:space="preserve"> </w:t>
       </w:r>
       <w:r>
-        <w:t xml:space="preserve">are bounded compute overhead — not budget — paid for</w:t>
+        <w:t xml:space="preserve">are bounded compute overhead (not budget) paid for</w:t>
       </w:r>
       <w:r>
         <w:t xml:space="preserve"> </w:t>
@@ -38613,7 +38595,7 @@
         <w:t xml:space="preserve"> </w:t>
       </w:r>
       <w:r>
-        <w:t xml:space="preserve">— none is exempt.</w:t>
+        <w:t xml:space="preserve">none is exempt.</w:t>
       </w:r>
       <w:r>
         <w:t xml:space="preserve"> </w:t>
@@ -38899,13 +38881,13 @@
         <w:t xml:space="preserve"> </w:t>
       </w:r>
       <w:r>
-        <w:t xml:space="preserve">resolution — tier by tier, with the unfavorable cells stated alongside</w:t>
-      </w:r>
-      <w:r>
-        <w:t xml:space="preserve"> </w:t>
-      </w:r>
-      <w:r>
-        <w:t xml:space="preserve">the favorable ones — because the dimension-resolved pattern, not a single</w:t>
+        <w:t xml:space="preserve">resolution (tier by tier, with the unfavorable cells stated alongside</w:t>
+      </w:r>
+      <w:r>
+        <w:t xml:space="preserve"> </w:t>
+      </w:r>
+      <w:r>
+        <w:t xml:space="preserve">the favorable ones) because the dimension-resolved pattern, not a single</w:t>
       </w:r>
       <w:r>
         <w:t xml:space="preserve"> </w:t>
@@ -38999,7 +38981,7 @@
         <w:t xml:space="preserve"> </w:t>
       </w:r>
       <w:r>
-        <w:t xml:space="preserve">Materials — never staging data and never</w:t>
+        <w:t xml:space="preserve">Materials, never staging data and never</w:t>
       </w:r>
       <w:r>
         <w:t xml:space="preserve"> </w:t>
@@ -39575,7 +39557,7 @@
         <w:t xml:space="preserve"> </w:t>
       </w:r>
       <w:r>
-        <w:t xml:space="preserve">Infeasible evaluations — for instance a failed trajectory integration</w:t>
+        <w:t xml:space="preserve">Infeasible evaluations, for instance a failed trajectory integration</w:t>
       </w:r>
       <w:r>
         <w:t xml:space="preserve"> </w:t>
@@ -39587,7 +39569,7 @@
         <w:t xml:space="preserve"> </w:t>
       </w:r>
       <w:r>
-        <w:t xml:space="preserve">— receive the reference implementation’s standard infeasibility penalty (</w:t>
+        <w:t xml:space="preserve">receive the reference implementation’s standard infeasibility penalty (</w:t>
       </w:r>
       <m:oMath>
         <m:sSup>
@@ -40162,13 +40144,13 @@
         <w:fldChar w:fldCharType="end"/>
       </w:r>
       <w:r>
-        <w:t xml:space="preserve"> — distinct from</w:t>
-      </w:r>
-      <w:r>
-        <w:t xml:space="preserve"> </w:t>
-      </w:r>
-      <w:r>
-        <w:t xml:space="preserve">the bound-constrained CEC2013 suite above — is the post-hoc,</w:t>
+        <w:t xml:space="preserve">, distinct from</w:t>
+      </w:r>
+      <w:r>
+        <w:t xml:space="preserve"> </w:t>
+      </w:r>
+      <w:r>
+        <w:t xml:space="preserve">the bound-constrained CEC2013 suite above, is the post-hoc,</w:t>
       </w:r>
       <w:r>
         <w:t xml:space="preserve"> </w:t>
@@ -42085,7 +42067,7 @@
         <w:t xml:space="preserve"> </w:t>
       </w:r>
       <w:r>
-        <w:t xml:space="preserve">documented exception — it self-initializes its own</w:t>
+        <w:t xml:space="preserve">documented exception: it self-initializes its own</w:t>
       </w:r>
       <w:r>
         <w:t xml:space="preserve"> </w:t>
@@ -42285,13 +42267,13 @@
         <w:t xml:space="preserve"> </w:t>
       </w:r>
       <w:r>
-        <w:t xml:space="preserve">across-function test on per-function means — the same test used for every</w:t>
-      </w:r>
-      <w:r>
-        <w:t xml:space="preserve"> </w:t>
-      </w:r>
-      <w:r>
-        <w:t xml:space="preserve">comparator — still applies to APGSK. Those run-level records were</w:t>
+        <w:t xml:space="preserve">across-function test on per-function means, the same test used for every</w:t>
+      </w:r>
+      <w:r>
+        <w:t xml:space="preserve"> </w:t>
+      </w:r>
+      <w:r>
+        <w:t xml:space="preserve">comparator, still applies to APGSK. Those run-level records were</w:t>
       </w:r>
       <w:r>
         <w:t xml:space="preserve"> </w:t>
@@ -42345,7 +42327,7 @@
         <w:t xml:space="preserve"> </w:t>
       </w:r>
       <w:r>
-        <w:t xml:space="preserve">(function, dimension, run) cells — 15 worker processes, with no parallelism</w:t>
+        <w:t xml:space="preserve">(function, dimension, run) cells: 15 worker processes, with no parallelism</w:t>
       </w:r>
       <w:r>
         <w:t xml:space="preserve"> </w:t>
@@ -42833,13 +42815,13 @@
         <w:t xml:space="preserve"> </w:t>
       </w:r>
       <w:r>
-        <w:t xml:space="preserve">search). The released evidence is unaffected — it is the archived</w:t>
-      </w:r>
-      <w:r>
-        <w:t xml:space="preserve"> </w:t>
-      </w:r>
-      <w:r>
-        <w:t xml:space="preserve">output of the original campaign — but a bit-identical re-timing of the</w:t>
+        <w:t xml:space="preserve">search). The released evidence is unaffected (it is the archived</w:t>
+      </w:r>
+      <w:r>
+        <w:t xml:space="preserve"> </w:t>
+      </w:r>
+      <w:r>
+        <w:t xml:space="preserve">output of the original campaign), but a bit-identical re-timing of the</w:t>
       </w:r>
       <w:r>
         <w:t xml:space="preserve"> </w:t>
@@ -43072,10 +43054,7 @@
         </m:sSup>
       </m:oMath>
       <w:r>
-        <w:t xml:space="preserve"> </w:t>
-      </w:r>
-      <w:r>
-        <w:t xml:space="preserve">— the same</w:t>
+        <w:t xml:space="preserve">: the same</w:t>
       </w:r>
       <w:r>
         <w:t xml:space="preserve"> </w:t>
@@ -43204,7 +43183,7 @@
         <w:t xml:space="preserve"> </w:t>
       </w:r>
       <w:r>
-        <w:t xml:space="preserve">scale-invariant — functions with larger numerical</w:t>
+        <w:t xml:space="preserve">scale-invariant; functions with larger numerical</w:t>
       </w:r>
       <w:r>
         <w:t xml:space="preserve"> </w:t>
@@ -43900,13 +43879,13 @@
         <w:t xml:space="preserve"> </w:t>
       </w:r>
       <w:r>
-        <w:t xml:space="preserve">computed over the 29 per-function mean errors — the same unit as the</w:t>
-      </w:r>
-      <w:r>
-        <w:t xml:space="preserve"> </w:t>
-      </w:r>
-      <w:r>
-        <w:t xml:space="preserve">across-function Wilcoxon — and is therefore an</w:t>
+        <w:t xml:space="preserve">computed over the 29 per-function mean errors (the same unit as the</w:t>
+      </w:r>
+      <w:r>
+        <w:t xml:space="preserve"> </w:t>
+      </w:r>
+      <w:r>
+        <w:t xml:space="preserve">across-function Wilcoxon) and is therefore an</w:t>
       </w:r>
       <w:r>
         <w:t xml:space="preserve"> </w:t>
@@ -44811,7 +44790,7 @@
         <w:t xml:space="preserve"> </w:t>
       </w:r>
       <w:r>
-        <w:t xml:space="preserve">per-comparison workbooks — including signed-rank sums</w:t>
+        <w:t xml:space="preserve">per-comparison workbooks, including signed-rank sums</w:t>
       </w:r>
       <w:r>
         <w:t xml:space="preserve"> </w:t>
@@ -44857,7 +44836,7 @@
         <w:t xml:space="preserve"> </w:t>
       </w:r>
       <w:r>
-        <w:t xml:space="preserve">and per-function detail — are released with the reproducibility bundle</w:t>
+        <w:t xml:space="preserve">and per-function detail, are released with the reproducibility bundle</w:t>
       </w:r>
       <w:r>
         <w:t xml:space="preserve"> </w:t>
@@ -45787,7 +45766,7 @@
         <w:t xml:space="preserve"> </w:t>
       </w:r>
       <w:r>
-        <w:t xml:space="preserve">mean ranks — a descriptive aggregation with no cross-dimension test</w:t>
+        <w:t xml:space="preserve">mean ranks, a descriptive aggregation with no cross-dimension test</w:t>
       </w:r>
       <w:r>
         <w:t xml:space="preserve"> </w:t>
@@ -47256,7 +47235,7 @@
         <w:t xml:space="preserve"> </w:t>
       </w:r>
       <w:r>
-        <w:t xml:space="preserve">— the matched-pairs rank-biserial</w:t>
+        <w:t xml:space="preserve">(the matched-pairs rank-biserial</w:t>
       </w:r>
       <w:r>
         <w:t xml:space="preserve"> </w:t>
@@ -47276,7 +47255,7 @@
         <w:t xml:space="preserve"> </w:t>
       </w:r>
       <w:r>
-        <w:t xml:space="preserve">mean ranks in the Supplementary Materials — because a</w:t>
+        <w:t xml:space="preserve">mean ranks in the Supplementary Materials) because a</w:t>
       </w:r>
       <w:r>
         <w:t xml:space="preserve"> </w:t>
@@ -51997,7 +51976,7 @@
         <w:pStyle w:val="BodyText"/>
       </w:pPr>
       <w:r>
-        <w:t xml:space="preserve">As a sensitivity check, applying Holm once across all 24 hypotheses — the</w:t>
+        <w:t xml:space="preserve">As a sensitivity check, applying Holm once across all 24 hypotheses (the</w:t>
       </w:r>
       <w:r>
         <w:t xml:space="preserve"> </w:t>
@@ -52009,7 +51988,7 @@
         <w:t xml:space="preserve"> </w:t>
       </w:r>
       <w:r>
-        <w:t xml:space="preserve">single family — leaves 15 of the 24 cells significant. Only two cells do</w:t>
+        <w:t xml:space="preserve">single family) leaves 15 of the 24 cells significant. Only two cells do</w:t>
       </w:r>
       <w:r>
         <w:t xml:space="preserve"> </w:t>
@@ -52405,10 +52384,7 @@
         </m:r>
       </m:oMath>
       <w:r>
-        <w:t xml:space="preserve"> </w:t>
-      </w:r>
-      <w:r>
-        <w:t xml:space="preserve">—</w:t>
+        <w:t xml:space="preserve">:</w:t>
       </w:r>
       <w:r>
         <w:t xml:space="preserve"> </w:t>
@@ -53699,7 +53675,7 @@
         <w:t xml:space="preserve"> </w:t>
       </w:r>
       <w:r>
-        <w:t xml:space="preserve">— 2.88, 2.50, 2.21, 2.34 —:</w:t>
+        <w:t xml:space="preserve">(2.88, 2.50, 2.21, 2.34):</w:t>
       </w:r>
       <w:r>
         <w:t xml:space="preserve"> </w:t>
@@ -53816,7 +53792,7 @@
         <w:t xml:space="preserve"> </w:t>
       </w:r>
       <w:r>
-        <w:t xml:space="preserve">— 21–4–4 becomes 17–10–2 against eGSK at</w:t>
+        <w:t xml:space="preserve">(21–4–4 becomes 17–10–2 against eGSK at</w:t>
       </w:r>
       <w:r>
         <w:t xml:space="preserve"> </w:t>
@@ -53836,10 +53812,7 @@
         </m:r>
       </m:oMath>
       <w:r>
-        <w:t xml:space="preserve"> </w:t>
-      </w:r>
-      <w:r>
-        <w:t xml:space="preserve">— and</w:t>
+        <w:t xml:space="preserve">) and</w:t>
       </w:r>
       <w:r>
         <w:t xml:space="preserve"> </w:t>
@@ -54087,7 +54060,7 @@
         <w:t xml:space="preserve"> </w:t>
       </w:r>
       <w:r>
-        <w:t xml:space="preserve">simple power loss — and an</w:t>
+        <w:t xml:space="preserve">simple power loss; and an</w:t>
       </w:r>
       <w:r>
         <w:t xml:space="preserve"> </w:t>
@@ -54299,13 +54272,13 @@
         <w:t xml:space="preserve"> </w:t>
       </w:r>
       <w:r>
-        <w:t xml:space="preserve">GSK on the 22 CEC2011 problems — together with the eGSK loss and the</w:t>
-      </w:r>
-      <w:r>
-        <w:t xml:space="preserve"> </w:t>
-      </w:r>
-      <w:r>
-        <w:t xml:space="preserve">DT-GSK-versus-GSK detail — are reported in the Supplementary Materials,</w:t>
+        <w:t xml:space="preserve">GSK on the 22 CEC2011 problems, together with the eGSK loss and the</w:t>
+      </w:r>
+      <w:r>
+        <w:t xml:space="preserve"> </w:t>
+      </w:r>
+      <w:r>
+        <w:t xml:space="preserve">DT-GSK-versus-GSK detail, are reported in the Supplementary Materials,</w:t>
       </w:r>
       <w:r>
         <w:t xml:space="preserve"> </w:t>
@@ -54751,7 +54724,7 @@
         <w:t xml:space="preserve"> </w:t>
       </w:r>
       <w:r>
-        <w:t xml:space="preserve">significant wins — against AGSK</w:t>
+        <w:t xml:space="preserve">significant wins, against AGSK</w:t>
       </w:r>
       <w:r>
         <w:t xml:space="preserve"> </w:t>
@@ -54905,7 +54878,7 @@
         </m:sSup>
       </m:oMath>
       <w:r>
-        <w:t xml:space="preserve">) — and no significant difference against GSK,</w:t>
+        <w:t xml:space="preserve">), and no significant difference against GSK,</w:t>
       </w:r>
       <w:r>
         <w:t xml:space="preserve"> </w:t>
@@ -55262,13 +55235,13 @@
         <w:t xml:space="preserve"> </w:t>
       </w:r>
       <w:r>
-        <w:t xml:space="preserve">real-world problems at native dimensions — a competitive placement</w:t>
-      </w:r>
-      <w:r>
-        <w:t xml:space="preserve"> </w:t>
-      </w:r>
-      <w:r>
-        <w:t xml:space="preserve">(second of seven) — and does not corroborate first place; no headline</w:t>
+        <w:t xml:space="preserve">real-world problems at native dimensions, a competitive placement</w:t>
+      </w:r>
+      <w:r>
+        <w:t xml:space="preserve"> </w:t>
+      </w:r>
+      <w:r>
+        <w:t xml:space="preserve">(second of seven), and does not corroborate first place; no headline</w:t>
       </w:r>
       <w:r>
         <w:t xml:space="preserve"> </w:t>
@@ -55460,13 +55433,13 @@
         <w:pStyle w:val="FirstParagraph"/>
       </w:pPr>
       <w:r>
-        <w:t xml:space="preserve">CEC2013 is reported as a second comparison suite — for breadth of</w:t>
-      </w:r>
-      <w:r>
-        <w:t xml:space="preserve"> </w:t>
-      </w:r>
-      <w:r>
-        <w:t xml:space="preserve">comparison under the identical protocol — and carries no</w:t>
+        <w:t xml:space="preserve">CEC2013 is reported as a second comparison suite, for breadth of</w:t>
+      </w:r>
+      <w:r>
+        <w:t xml:space="preserve"> </w:t>
+      </w:r>
+      <w:r>
+        <w:t xml:space="preserve">comparison under the identical protocol, and carries no</w:t>
       </w:r>
       <w:r>
         <w:t xml:space="preserve"> </w:t>
@@ -56952,13 +56925,13 @@
         <w:t xml:space="preserve"> </w:t>
       </w:r>
       <w:r>
-        <w:t xml:space="preserve">the mid-dimension tier is where the improved family variants —</w:t>
-      </w:r>
-      <w:r>
-        <w:t xml:space="preserve"> </w:t>
-      </w:r>
-      <w:r>
-        <w:t xml:space="preserve">eGSK and ATMALS-GSK in particular — are hardest to separate,</w:t>
+        <w:t xml:space="preserve">the mid-dimension tier is where the improved family variants,</w:t>
+      </w:r>
+      <w:r>
+        <w:t xml:space="preserve"> </w:t>
+      </w:r>
+      <w:r>
+        <w:t xml:space="preserve">eGSK and ATMALS-GSK in particular, are hardest to separate,</w:t>
       </w:r>
       <w:r>
         <w:t xml:space="preserve"> </w:t>
@@ -57022,7 +56995,7 @@
         <w:pStyle w:val="FirstParagraph"/>
       </w:pPr>
       <w:r>
-        <w:t xml:space="preserve">CEC2020 is the one suite in this study whose entire analysis — the</w:t>
+        <w:t xml:space="preserve">CEC2020 is the one suite in this study whose entire analysis (the</w:t>
       </w:r>
       <w:r>
         <w:t xml:space="preserve"> </w:t>
@@ -57034,7 +57007,7 @@
         <w:t xml:space="preserve"> </w:t>
       </w:r>
       <w:r>
-        <w:t xml:space="preserve">outcome sentences — was committed to the repository before any CEC2020</w:t>
+        <w:t xml:space="preserve">outcome sentences) was committed to the repository before any CEC2020</w:t>
       </w:r>
       <w:r>
         <w:t xml:space="preserve"> </w:t>
@@ -57325,7 +57298,7 @@
         <w:pStyle w:val="BodyText"/>
       </w:pPr>
       <w:r>
-        <w:t xml:space="preserve">On AGSK’s strongest suite — the CEC2020 competition in which it was</w:t>
+        <w:t xml:space="preserve">On AGSK’s strongest suite, the CEC2020 competition in which it was</w:t>
       </w:r>
       <w:r>
         <w:t xml:space="preserve"> </w:t>
@@ -57349,7 +57322,7 @@
         <w:fldChar w:fldCharType="end"/>
       </w:r>
       <w:r>
-        <w:t xml:space="preserve"> — DT-GSK places fourth; the family</w:t>
+        <w:t xml:space="preserve">, DT-GSK places fourth; the family</w:t>
       </w:r>
       <w:r>
         <w:t xml:space="preserve"> </w:t>
@@ -57361,7 +57334,7 @@
         <w:t xml:space="preserve"> </w:t>
       </w:r>
       <w:r>
-        <w:t xml:space="preserve">evaluates the low-dimensional boundary condition of the tiered design —</w:t>
+        <w:t xml:space="preserve">evaluates the low-dimensional boundary condition of the tiered design (</w:t>
       </w:r>
       <w:r>
         <w:t xml:space="preserve"> </w:t>
@@ -57387,10 +57360,7 @@
         </m:r>
       </m:oMath>
       <w:r>
-        <w:t xml:space="preserve"> </w:t>
-      </w:r>
-      <w:r>
-        <w:t xml:space="preserve">—</w:t>
+        <w:t xml:space="preserve">)</w:t>
       </w:r>
       <w:r>
         <w:t xml:space="preserve"> </w:t>
@@ -57485,7 +57455,7 @@
         <w:t xml:space="preserve"> </w:t>
       </w:r>
       <w:r>
-        <w:t xml:space="preserve">tier — the optional</w:t>
+        <w:t xml:space="preserve">tier (the optional</w:t>
       </w:r>
       <w:r>
         <w:t xml:space="preserve"> </w:t>
@@ -57503,7 +57473,7 @@
         <w:t xml:space="preserve"> </w:t>
       </w:r>
       <w:r>
-        <w:t xml:space="preserve">change — while the gated subsystems themselves (the</w:t>
+        <w:t xml:space="preserve">change) while the gated subsystems themselves (the</w:t>
       </w:r>
       <w:r>
         <w:t xml:space="preserve"> </w:t>
@@ -59359,7 +59329,7 @@
         <w:t xml:space="preserve"> </w:t>
       </w:r>
       <w:r>
-        <w:t xml:space="preserve">three favorable — against ATMALS-GSK and eGSK at</w:t>
+        <w:t xml:space="preserve">three favorable (against ATMALS-GSK and eGSK at</w:t>
       </w:r>
       <w:r>
         <w:t xml:space="preserve"> </w:t>
@@ -59405,10 +59375,7 @@
         </m:r>
       </m:oMath>
       <w:r>
-        <w:t xml:space="preserve"> </w:t>
-      </w:r>
-      <w:r>
-        <w:t xml:space="preserve">— and two unfavorable — against AGSK</w:t>
+        <w:t xml:space="preserve">) and two unfavorable, against AGSK</w:t>
       </w:r>
       <w:r>
         <w:t xml:space="preserve"> </w:t>
@@ -59497,7 +59464,7 @@
         <w:t xml:space="preserve"> </w:t>
       </w:r>
       <w:r>
-        <w:t xml:space="preserve">expectation predicted in advance — AGSK and APGSK favored on</w:t>
+        <w:t xml:space="preserve">expectation predicted in advance (AGSK and APGSK favored on</w:t>
       </w:r>
       <w:r>
         <w:t xml:space="preserve"> </w:t>
@@ -59529,10 +59496,7 @@
         </m:r>
       </m:oMath>
       <w:r>
-        <w:t xml:space="preserve"> </w:t>
-      </w:r>
-      <w:r>
-        <w:t xml:space="preserve">— and it is reported as such, not as a result that</w:t>
+        <w:t xml:space="preserve">), and it is reported as such, not as a result that</w:t>
       </w:r>
       <w:r>
         <w:t xml:space="preserve"> </w:t>
@@ -59623,7 +59587,7 @@
         <w:t xml:space="preserve"> </w:t>
       </w:r>
       <w:r>
-        <w:t xml:space="preserve">Dedicated large-scale optimizers — for example</w:t>
+        <w:t xml:space="preserve">Dedicated large-scale optimizers, for example</w:t>
       </w:r>
       <w:r>
         <w:t xml:space="preserve"> </w:t>
@@ -59665,7 +59629,7 @@
         <w:fldChar w:fldCharType="end"/>
       </w:r>
       <w:r>
-        <w:t xml:space="preserve"> —</w:t>
+        <w:t xml:space="preserve">,</w:t>
       </w:r>
       <w:r>
         <w:t xml:space="preserve"> </w:t>
@@ -60762,7 +60726,7 @@
         </m:r>
       </m:oMath>
       <w:r>
-        <w:t xml:space="preserve">) — the registered ceiling wording,</w:t>
+        <w:t xml:space="preserve">); the registered ceiling wording,</w:t>
       </w:r>
       <w:r>
         <w:t xml:space="preserve"> </w:t>
@@ -60848,7 +60812,7 @@
         <w:pStyle w:val="BodyText"/>
       </w:pPr>
       <w:r>
-        <w:t xml:space="preserve">The one DT-GSK-specific configuration addition on this suite — the</w:t>
+        <w:t xml:space="preserve">The one DT-GSK-specific configuration addition on this suite (the</w:t>
       </w:r>
       <w:r>
         <w:t xml:space="preserve"> </w:t>
@@ -60924,7 +60888,7 @@
         <w:fldChar w:fldCharType="end"/>
       </w:r>
       <w:r>
-        <w:t xml:space="preserve"> — is disclosed, with its rule,</w:t>
+        <w:t xml:space="preserve">) is disclosed, with its rule,</w:t>
       </w:r>
       <w:r>
         <w:t xml:space="preserve"> </w:t>
@@ -61054,7 +61018,7 @@
         <w:t xml:space="preserve"> </w:t>
       </w:r>
       <w:r>
-        <w:t xml:space="preserve">and F26 (composition, hard/weak — the mandated unfavorable case).</w:t>
+        <w:t xml:space="preserve">and F26 (composition, hard/weak, the mandated unfavorable case).</w:t>
       </w:r>
       <w:r>
         <w:t xml:space="preserve"> </w:t>
@@ -61125,7 +61089,7 @@
         <w:t xml:space="preserve"> </w:t>
       </w:r>
       <w:r>
-        <w:t xml:space="preserve">runs of that algorithm — the identical aggregation basis for all</w:t>
+        <w:t xml:space="preserve">runs of that algorithm (the identical aggregation basis for all</w:t>
       </w:r>
       <w:r>
         <w:t xml:space="preserve"> </w:t>
@@ -61137,7 +61101,7 @@
         <w:t xml:space="preserve"> </w:t>
       </w:r>
       <w:r>
-        <w:t xml:space="preserve">interpolation — on a log-error axis whose display-only floor of</w:t>
+        <w:t xml:space="preserve">interpolation) on a log-error axis whose display-only floor of</w:t>
       </w:r>
       <w:r>
         <w:t xml:space="preserve"> </w:t>
@@ -61172,7 +61136,7 @@
         <w:t xml:space="preserve"> </w:t>
       </w:r>
       <w:r>
-        <w:t xml:space="preserve">complete convergence sets — CEC2017 at all four dimensions, CEC2011</w:t>
+        <w:t xml:space="preserve">complete convergence sets (CEC2017 at all four dimensions, CEC2011</w:t>
       </w:r>
       <w:r>
         <w:t xml:space="preserve"> </w:t>
@@ -61198,10 +61162,7 @@
         </m:r>
       </m:oMath>
       <w:r>
-        <w:t xml:space="preserve"> </w:t>
-      </w:r>
-      <w:r>
-        <w:t xml:space="preserve">— are</w:t>
+        <w:t xml:space="preserve">) are</w:t>
       </w:r>
       <w:r>
         <w:t xml:space="preserve"> </w:t>
@@ -61842,7 +61803,7 @@
           <wp:inline>
             <wp:extent cx="5620004" cy="4148894"/>
             <wp:effectExtent b="0" l="0" r="0" t="0"/>
-            <wp:docPr descr="Figure 6.  Family-overlay convergence on CEC2017 at  — DT-GSK’s known-weak tier, ranked second behind eGSK — for the four prespecified functions: F3 (unimodal; easy/strong), F10 (simple multimodal; hard/comparable), F12 (hybrid; hard/comparable), F26 (composition; hard/weak, the mandated unfavorable case). Shared basis as stated above; APGSK checkpoint evidence at  carries the per-run availability qualification of Section 4.1." title="" id="84" name="Picture"/>
+            <wp:docPr descr="Figure 6.  Family-overlay convergence on CEC2017 at  ( DT-GSK’s known-weak tier, ranked second behind eGSK) for the four prespecified functions: F3 (unimodal; easy/strong), F10 (simple multimodal; hard/comparable), F12 (hybrid; hard/comparable), F26 (composition; hard/weak, the mandated unfavorable case). Shared basis as stated above; APGSK checkpoint evidence at  carries the per-run availability qualification of Section 4.1." title="" id="84" name="Picture"/>
             <a:graphic>
               <a:graphicData uri="http://schemas.openxmlformats.org/drawingml/2006/picture">
                 <pic:pic>
@@ -61941,13 +61902,13 @@
         <w:t xml:space="preserve"> </w:t>
       </w:r>
       <w:r>
-        <w:t xml:space="preserve">—</w:t>
-      </w:r>
-      <w:r>
-        <w:t xml:space="preserve"> </w:t>
-      </w:r>
-      <w:r>
-        <w:t xml:space="preserve">DT-GSK’s known-weak tier, ranked second behind eGSK — for the four</w:t>
+        <w:t xml:space="preserve">(</w:t>
+      </w:r>
+      <w:r>
+        <w:t xml:space="preserve"> </w:t>
+      </w:r>
+      <w:r>
+        <w:t xml:space="preserve">DT-GSK’s known-weak tier, ranked second behind eGSK) for the four</w:t>
       </w:r>
       <w:r>
         <w:t xml:space="preserve"> </w:t>
@@ -62332,10 +62293,7 @@
         </m:r>
       </m:oMath>
       <w:r>
-        <w:t xml:space="preserve"> </w:t>
-      </w:r>
-      <w:r>
-        <w:t xml:space="preserve">— the bookkeeping cost of its scaffold and</w:t>
+        <w:t xml:space="preserve">: the bookkeeping cost of its scaffold and</w:t>
       </w:r>
       <w:r>
         <w:t xml:space="preserve"> </w:t>
@@ -63224,10 +63182,7 @@
         </m:r>
       </m:oMath>
       <w:r>
-        <w:t xml:space="preserve"> </w:t>
-      </w:r>
-      <w:r>
-        <w:t xml:space="preserve">— a five-fold difference</w:t>
+        <w:t xml:space="preserve">, a five-fold difference</w:t>
       </w:r>
       <w:r>
         <w:t xml:space="preserve"> </w:t>
@@ -63349,7 +63304,7 @@
         <w:t xml:space="preserve"> </w:t>
       </w:r>
       <w:r>
-        <w:t xml:space="preserve">independent of configuration selection — the single configuration was fixed on</w:t>
+        <w:t xml:space="preserve">independent of configuration selection: the single configuration was fixed on</w:t>
       </w:r>
       <w:r>
         <w:t xml:space="preserve"> </w:t>
@@ -63968,13 +63923,13 @@
         <w:t xml:space="preserve"> </w:t>
       </w:r>
       <w:r>
-        <w:t xml:space="preserve">and several subsystems — the eigenframe polish and the raised population</w:t>
-      </w:r>
-      <w:r>
-        <w:t xml:space="preserve"> </w:t>
-      </w:r>
-      <w:r>
-        <w:t xml:space="preserve">floor — co-activate at</w:t>
+        <w:t xml:space="preserve">and several subsystems (the eigenframe polish and the raised population</w:t>
+      </w:r>
+      <w:r>
+        <w:t xml:space="preserve"> </w:t>
+      </w:r>
+      <w:r>
+        <w:t xml:space="preserve">floor) co-activate at</w:t>
       </w:r>
       <w:r>
         <w:t xml:space="preserve"> </w:t>
@@ -64121,7 +64076,7 @@
         <w:t xml:space="preserve"> </w:t>
       </w:r>
       <w:r>
-        <w:t xml:space="preserve">adaptive scaffold, so low-dimension behavior — including the</w:t>
+        <w:t xml:space="preserve">adaptive scaffold, so low-dimension behavior, including the</w:t>
       </w:r>
       <w:r>
         <w:t xml:space="preserve"> </w:t>
@@ -64164,10 +64119,7 @@
         </m:r>
       </m:oMath>
       <w:r>
-        <w:t xml:space="preserve"> </w:t>
-      </w:r>
-      <w:r>
-        <w:t xml:space="preserve">— reflects this structural gating rather than the tier-gated</w:t>
+        <w:t xml:space="preserve">, reflects this structural gating rather than the tier-gated</w:t>
       </w:r>
       <w:r>
         <w:t xml:space="preserve"> </w:t>
@@ -64288,7 +64240,7 @@
         <w:t xml:space="preserve"> </w:t>
       </w:r>
       <w:r>
-        <w:t xml:space="preserve">significant difference, and one significant loss — the loss to eGSK</w:t>
+        <w:t xml:space="preserve">significant difference, and one significant loss, the loss to eGSK</w:t>
       </w:r>
       <w:r>
         <w:t xml:space="preserve"> </w:t>
@@ -64365,7 +64317,7 @@
         </m:sSup>
       </m:oMath>
       <w:r>
-        <w:t xml:space="preserve">) — so the real-world</w:t>
+        <w:t xml:space="preserve">), so the real-world</w:t>
       </w:r>
       <w:r>
         <w:t xml:space="preserve"> </w:t>
@@ -64466,13 +64418,13 @@
         <w:t xml:space="preserve"> </w:t>
       </w:r>
       <w:r>
-        <w:t xml:space="preserve">from DT-GSK, and the run-level regularity — better than all six on</w:t>
-      </w:r>
-      <w:r>
-        <w:t xml:space="preserve"> </w:t>
-      </w:r>
-      <w:r>
-        <w:t xml:space="preserve">F4 and F8, worse than all six on F7 and F15 — is stated in both</w:t>
+        <w:t xml:space="preserve">from DT-GSK, and the run-level regularity (better than all six on</w:t>
+      </w:r>
+      <w:r>
+        <w:t xml:space="preserve"> </w:t>
+      </w:r>
+      <w:r>
+        <w:t xml:space="preserve">F4 and F8, worse than all six on F7 and F15) is stated in both</w:t>
       </w:r>
       <w:r>
         <w:t xml:space="preserve"> </w:t>
@@ -64528,7 +64480,7 @@
         <w:t xml:space="preserve"> </w:t>
       </w:r>
       <w:r>
-        <w:t xml:space="preserve">aggregates — first on CEC2017 (2.48) and CEC2013 (2.80), tied-first</w:t>
+        <w:t xml:space="preserve">aggregates: first on CEC2017 (2.48) and CEC2013 (2.80), tied-first</w:t>
       </w:r>
       <w:r>
         <w:t xml:space="preserve"> </w:t>
@@ -64804,7 +64756,7 @@
         <w:t xml:space="preserve"> </w:t>
       </w:r>
       <w:r>
-        <w:t xml:space="preserve">twice — as linkage blocks for the block crossover, and as the eigenbasis of</w:t>
+        <w:t xml:space="preserve">twice: as linkage blocks for the block crossover, and as the eigenbasis of</w:t>
       </w:r>
       <w:r>
         <w:t xml:space="preserve"> </w:t>
@@ -64866,7 +64818,7 @@
         <w:pStyle w:val="BodyText"/>
       </w:pPr>
       <w:r>
-        <w:t xml:space="preserve">The empirical findings are panel-scoped and dimension-resolved — the</w:t>
+        <w:t xml:space="preserve">The empirical findings are panel-scoped and dimension-resolved (the</w:t>
       </w:r>
       <w:r>
         <w:t xml:space="preserve"> </w:t>
@@ -64878,7 +64830,7 @@
         <w:t xml:space="preserve"> </w:t>
       </w:r>
       <w:r>
-        <w:t xml:space="preserve">claiming uniform dominance — and the unfavorable cells are stated with</w:t>
+        <w:t xml:space="preserve">claiming uniform dominance), and the unfavorable cells are stated with</w:t>
       </w:r>
       <w:r>
         <w:t xml:space="preserve"> </w:t>
@@ -64890,7 +64842,7 @@
         <w:t xml:space="preserve"> </w:t>
       </w:r>
       <w:r>
-        <w:t xml:space="preserve">on CEC2017, DT-GSK attains the best overall Friedman mean rank —</w:t>
+        <w:t xml:space="preserve">on CEC2017, DT-GSK attains the best overall Friedman mean rank (</w:t>
       </w:r>
       <w:r>
         <w:t xml:space="preserve"> </w:t>
@@ -64902,7 +64854,7 @@
         <w:t xml:space="preserve"> </w:t>
       </w:r>
       <w:r>
-        <w:t xml:space="preserve">eGSK second at 2.96 — placing first at</w:t>
+        <w:t xml:space="preserve">eGSK second at 2.96) placing first at</w:t>
       </w:r>
       <w:r>
         <w:t xml:space="preserve"> </w:t>
@@ -64990,7 +64942,7 @@
         <w:t xml:space="preserve"> </w:t>
       </w:r>
       <w:r>
-        <w:t xml:space="preserve">wins, 7 with no significant difference, and no significant loss — a</w:t>
+        <w:t xml:space="preserve">wins, 7 with no significant difference, and no significant loss: a</w:t>
       </w:r>
       <w:r>
         <w:t xml:space="preserve"> </w:t>
@@ -65360,7 +65312,7 @@
         <w:t xml:space="preserve"> </w:t>
       </w:r>
       <w:r>
-        <w:t xml:space="preserve">profile of first/third/first — third at</w:t>
+        <w:t xml:space="preserve">profile of first/third/first: third at</w:t>
       </w:r>
       <w:r>
         <w:t xml:space="preserve"> </w:t>
@@ -65395,7 +65347,7 @@
         <w:t xml:space="preserve"> </w:t>
       </w:r>
       <w:r>
-        <w:t xml:space="preserve">On AGSK’s strongest suite — the CEC2020 competition in which it was</w:t>
+        <w:t xml:space="preserve">On AGSK’s strongest suite, the CEC2020 competition in which it was</w:t>
       </w:r>
       <w:r>
         <w:t xml:space="preserve"> </w:t>
@@ -65419,7 +65371,7 @@
         <w:fldChar w:fldCharType="end"/>
       </w:r>
       <w:r>
-        <w:t xml:space="preserve"> — DT-GSK places fourth; the family</w:t>
+        <w:t xml:space="preserve">, DT-GSK places fourth; the family</w:t>
       </w:r>
       <w:r>
         <w:t xml:space="preserve"> </w:t>
@@ -65431,7 +65383,7 @@
         <w:t xml:space="preserve"> </w:t>
       </w:r>
       <w:r>
-        <w:t xml:space="preserve">evaluates the low-dimensional boundary condition of the tiered design —</w:t>
+        <w:t xml:space="preserve">evaluates the low-dimensional boundary condition of the tiered design (</w:t>
       </w:r>
       <w:r>
         <w:t xml:space="preserve"> </w:t>
@@ -65457,10 +65409,7 @@
         </m:r>
       </m:oMath>
       <w:r>
-        <w:t xml:space="preserve"> </w:t>
-      </w:r>
-      <w:r>
-        <w:t xml:space="preserve">—</w:t>
+        <w:t xml:space="preserve">)</w:t>
       </w:r>
       <w:r>
         <w:t xml:space="preserve"> </w:t>
@@ -65472,13 +65421,13 @@
         <w:t xml:space="preserve"> </w:t>
       </w:r>
       <w:r>
-        <w:t xml:space="preserve">leg — its analysis and outcome wording were committed before any of</w:t>
-      </w:r>
-      <w:r>
-        <w:t xml:space="preserve"> </w:t>
-      </w:r>
-      <w:r>
-        <w:t xml:space="preserve">its data existed — and DT-GSK is Holm-separated in only five of its</w:t>
+        <w:t xml:space="preserve">leg (its analysis and outcome wording were committed before any of</w:t>
+      </w:r>
+      <w:r>
+        <w:t xml:space="preserve"> </w:t>
+      </w:r>
+      <w:r>
+        <w:t xml:space="preserve">its data existed), and DT-GSK is Holm-separated in only five of its</w:t>
       </w:r>
       <w:r>
         <w:t xml:space="preserve"> </w:t>
@@ -65514,7 +65463,7 @@
         <w:t xml:space="preserve"> </w:t>
       </w:r>
       <w:r>
-        <w:t xml:space="preserve">— nor from any other family member across functions; at run level it</w:t>
+        <w:t xml:space="preserve">, nor from any other family member across functions; at run level it</w:t>
       </w:r>
       <w:r>
         <w:t xml:space="preserve"> </w:t>
@@ -65586,13 +65535,13 @@
         <w:t xml:space="preserve"> </w:t>
       </w:r>
       <w:r>
-        <w:t xml:space="preserve">under both registered across-dimension aggregate variants — the</w:t>
-      </w:r>
-      <w:r>
-        <w:t xml:space="preserve"> </w:t>
-      </w:r>
-      <w:r>
-        <w:t xml:space="preserve">pre-committed instability rule did not fire — while the median re-rank</w:t>
+        <w:t xml:space="preserve">under both registered across-dimension aggregate variants (the</w:t>
+      </w:r>
+      <w:r>
+        <w:t xml:space="preserve"> </w:t>
+      </w:r>
+      <w:r>
+        <w:t xml:space="preserve">pre-committed instability rule did not fire), while the median re-rank</w:t>
       </w:r>
       <w:r>
         <w:t xml:space="preserve"> </w:t>
@@ -65853,13 +65802,13 @@
         <w:t xml:space="preserve"> </w:t>
       </w:r>
       <w:r>
-        <w:t xml:space="preserve">the family ordinal unchanged — boundary-level findings, attributed to no</w:t>
-      </w:r>
-      <w:r>
-        <w:t xml:space="preserve"> </w:t>
-      </w:r>
-      <w:r>
-        <w:t xml:space="preserve">individual mechanism, that extend the disclosed mis-specification.</w:t>
+        <w:t xml:space="preserve">the family ordinal unchanged (boundary-level findings, attributed to no</w:t>
+      </w:r>
+      <w:r>
+        <w:t xml:space="preserve"> </w:t>
+      </w:r>
+      <w:r>
+        <w:t xml:space="preserve">individual mechanism, that extend the disclosed mis-specification).</w:t>
       </w:r>
       <w:r>
         <w:t xml:space="preserve"> </w:t>
@@ -66492,7 +66441,7 @@
         <w:t xml:space="preserve"> </w:t>
       </w:r>
       <w:r>
-        <w:t xml:space="preserve">external non-GSK baseline enters any panel, table, figure or claim —</w:t>
+        <w:t xml:space="preserve">external non-GSK baseline enters any panel, table, figure or claim;</w:t>
       </w:r>
       <w:r>
         <w:t xml:space="preserve"> </w:t>
@@ -66620,7 +66569,7 @@
         <w:t xml:space="preserve"> </w:t>
       </w:r>
       <w:r>
-        <w:t xml:space="preserve">component study — each component disabled in turn within the otherwise</w:t>
+        <w:t xml:space="preserve">component study (each component disabled in turn within the otherwise</w:t>
       </w:r>
       <w:r>
         <w:t xml:space="preserve"> </w:t>
@@ -66644,7 +66593,7 @@
         <w:t xml:space="preserve"> </w:t>
       </w:r>
       <w:r>
-        <w:t xml:space="preserve">every cell — is reported in the Supplementary Materials, as is a</w:t>
+        <w:t xml:space="preserve">every cell) is reported in the Supplementary Materials, as is a</w:t>
       </w:r>
       <w:r>
         <w:t xml:space="preserve"> </w:t>
@@ -66799,13 +66748,13 @@
         <w:t xml:space="preserve"> </w:t>
       </w:r>
       <w:r>
-        <w:t xml:space="preserve">memory’s terminal exploitation channel — the basis the final polish searches</w:t>
-      </w:r>
-      <w:r>
-        <w:t xml:space="preserve"> </w:t>
-      </w:r>
-      <w:r>
-        <w:t xml:space="preserve">along — the learned eigenframe is outperformed by the plain coordinate axes at</w:t>
+        <w:t xml:space="preserve">memory’s terminal exploitation channel (the basis the final polish searches</w:t>
+      </w:r>
+      <w:r>
+        <w:t xml:space="preserve"> </w:t>
+      </w:r>
+      <w:r>
+        <w:t xml:space="preserve">along), the learned eigenframe is outperformed by the plain coordinate axes at</w:t>
       </w:r>
       <w:r>
         <w:t xml:space="preserve"> </w:t>
@@ -67223,13 +67172,13 @@
         <w:pStyle w:val="BodyText"/>
       </w:pPr>
       <w:r>
-        <w:t xml:space="preserve">And evaluation beyond the family — non-GSK baselines under the same</w:t>
-      </w:r>
-      <w:r>
-        <w:t xml:space="preserve"> </w:t>
-      </w:r>
-      <w:r>
-        <w:t xml:space="preserve">locked, budget-fair protocol — is the natural external test of the</w:t>
+        <w:t xml:space="preserve">And evaluation beyond the family (non-GSK baselines under the same</w:t>
+      </w:r>
+      <w:r>
+        <w:t xml:space="preserve"> </w:t>
+      </w:r>
+      <w:r>
+        <w:t xml:space="preserve">locked, budget-fair protocol) is the natural external test of the</w:t>
       </w:r>
       <w:r>
         <w:t xml:space="preserve"> </w:t>
@@ -67344,7 +67293,7 @@
         <w:t xml:space="preserve"> </w:t>
       </w:r>
       <w:r>
-        <w:t xml:space="preserve">supplement-only component-contribution study — a scaffold</w:t>
+        <w:t xml:space="preserve">supplement-only component-contribution study: a scaffold</w:t>
       </w:r>
       <w:r>
         <w:t xml:space="preserve"> </w:t>
@@ -67368,7 +67317,7 @@
         <w:t xml:space="preserve"> </w:t>
       </w:r>
       <w:r>
-        <w:t xml:space="preserve">freeze and altering no primary result, together with the per-component cost accounting, the post-hoc function-class analysis, and the implementation-caveats trail for the two corrected defects — the material the main text cites as S6.5, S6.6, and S6.7 (S6); the CEC2013LSGO large-scale study, with its family-internal scope, evidential-tier and provenance disclosures (S7); the pre-registered CEC2020 confirmatory battery, reported with its registered outcome wording (S8); and the mechanism-isolation and sensitivity experiments — the refinement-basis isolation, the matched-population-size control, the tiered-versus-tier-constant transplant, the exploratory selected-constant screen, and the dimension-boundary study — each pre-registered before it produced a result (S9).</w:t>
+        <w:t xml:space="preserve">freeze and altering no primary result, together with the per-component cost accounting, the post-hoc function-class analysis, and the implementation-caveats trail for the two corrected defects (the material the main text cites as S6.5, S6.6, and S6.7) (S6); the CEC2013LSGO large-scale study, with its family-internal scope, evidential-tier and provenance disclosures (S7); the pre-registered CEC2020 confirmatory battery, reported with its registered outcome wording (S8); and the mechanism-isolation and sensitivity experiments (the refinement-basis isolation, the matched-population-size control, the tiered-versus-tier-constant transplant, the exploratory selected-constant screen, and the dimension-boundary study), each pre-registered before it produced a result (S9).</w:t>
       </w:r>
     </w:p>
     <w:bookmarkEnd w:id="102"/>
@@ -67928,7 +67877,7 @@
         <w:t xml:space="preserve"> </w:t>
       </w:r>
       <w:r>
-        <w:t xml:space="preserve">generative artificial intelligence. No scientific content — the</w:t>
+        <w:t xml:space="preserve">generative artificial intelligence. No scientific content (the</w:t>
       </w:r>
       <w:r>
         <w:t xml:space="preserve"> </w:t>
@@ -67940,7 +67889,7 @@
         <w:t xml:space="preserve"> </w:t>
       </w:r>
       <w:r>
-        <w:t xml:space="preserve">reported number — was AI-generated. The authors have reviewed and</w:t>
+        <w:t xml:space="preserve">reported number) was AI-generated. The authors have reviewed and</w:t>
       </w:r>
       <w:r>
         <w:t xml:space="preserve"> </w:t>

</xml_diff>